<commit_message>
Mise à jour du rapport : SHA-256, commit utils.py, architecture, exemples POO
Co-Authored-By: Claude Sonnet 4.6 <noreply@anthropic.com>
</commit_message>
<xml_diff>
--- a/Production personnelle compétence-DY63 .docx
+++ b/Production personnelle compétence-DY63 .docx
@@ -916,25 +916,15 @@
         <w:t xml:space="preserve">git </w:t>
       </w:r>
       <w:proofErr w:type="spellStart"/>
-      <w:proofErr w:type="gramStart"/>
       <w:r>
         <w:rPr>
           <w:rFonts w:asciiTheme="minorHAnsi" w:eastAsiaTheme="minorHAnsi" w:hAnsiTheme="minorHAnsi" w:cstheme="minorBidi"/>
           <w:szCs w:val="22"/>
           <w:lang w:eastAsia="en-US"/>
         </w:rPr>
-        <w:t>add</w:t>
+        <w:t>status</w:t>
       </w:r>
       <w:proofErr w:type="spellEnd"/>
-      <w:r>
-        <w:rPr>
-          <w:rFonts w:asciiTheme="minorHAnsi" w:eastAsiaTheme="minorHAnsi" w:hAnsiTheme="minorHAnsi" w:cstheme="minorBidi"/>
-          <w:szCs w:val="22"/>
-          <w:lang w:eastAsia="en-US"/>
-        </w:rPr>
-        <w:t xml:space="preserve"> .</w:t>
-      </w:r>
-      <w:proofErr w:type="gramEnd"/>
     </w:p>
     <w:p>
       <w:pPr>
@@ -955,26 +945,61 @@
           <w:szCs w:val="22"/>
           <w:lang w:eastAsia="en-US"/>
         </w:rPr>
-        <w:t>git commit -m "</w:t>
-      </w:r>
-      <w:r>
-        <w:t xml:space="preserve"> </w:t>
-      </w:r>
+        <w:t xml:space="preserve">git </w:t>
+      </w:r>
+      <w:proofErr w:type="spellStart"/>
       <w:r>
         <w:rPr>
           <w:rFonts w:asciiTheme="minorHAnsi" w:eastAsiaTheme="minorHAnsi" w:hAnsiTheme="minorHAnsi" w:cstheme="minorBidi"/>
           <w:szCs w:val="22"/>
           <w:lang w:eastAsia="en-US"/>
         </w:rPr>
-        <w:t>Initialisation du projet streaming_app_00Q6</w:t>
-      </w:r>
+        <w:t>add</w:t>
+      </w:r>
+      <w:proofErr w:type="spellEnd"/>
       <w:r>
         <w:rPr>
           <w:rFonts w:asciiTheme="minorHAnsi" w:eastAsiaTheme="minorHAnsi" w:hAnsiTheme="minorHAnsi" w:cstheme="minorBidi"/>
           <w:szCs w:val="22"/>
           <w:lang w:eastAsia="en-US"/>
         </w:rPr>
-        <w:t>"</w:t>
+        <w:t xml:space="preserve"> </w:t>
+      </w:r>
+      <w:proofErr w:type="spellStart"/>
+      <w:r>
+        <w:rPr>
+          <w:rFonts w:asciiTheme="minorHAnsi" w:eastAsiaTheme="minorHAnsi" w:hAnsiTheme="minorHAnsi" w:cstheme="minorBidi"/>
+          <w:szCs w:val="22"/>
+          <w:lang w:eastAsia="en-US"/>
+        </w:rPr>
+        <w:t>streaming_app</w:t>
+      </w:r>
+      <w:proofErr w:type="spellEnd"/>
+      <w:r>
+        <w:rPr>
+          <w:rFonts w:asciiTheme="minorHAnsi" w:eastAsiaTheme="minorHAnsi" w:hAnsiTheme="minorHAnsi" w:cstheme="minorBidi"/>
+          <w:szCs w:val="22"/>
+          <w:lang w:eastAsia="en-US"/>
+        </w:rPr>
+        <w:t>/</w:t>
+      </w:r>
+      <w:proofErr w:type="spellStart"/>
+      <w:r>
+        <w:rPr>
+          <w:rFonts w:asciiTheme="minorHAnsi" w:eastAsiaTheme="minorHAnsi" w:hAnsiTheme="minorHAnsi" w:cstheme="minorBidi"/>
+          <w:szCs w:val="22"/>
+          <w:lang w:eastAsia="en-US"/>
+        </w:rPr>
+        <w:t>models</w:t>
+      </w:r>
+      <w:proofErr w:type="spellEnd"/>
+      <w:r>
+        <w:rPr>
+          <w:rFonts w:asciiTheme="minorHAnsi" w:eastAsiaTheme="minorHAnsi" w:hAnsiTheme="minorHAnsi" w:cstheme="minorBidi"/>
+          <w:szCs w:val="22"/>
+          <w:lang w:eastAsia="en-US"/>
+        </w:rPr>
+        <w:t>/</w:t>
       </w:r>
     </w:p>
     <w:p>
@@ -996,18 +1021,275 @@
           <w:szCs w:val="22"/>
           <w:lang w:eastAsia="en-US"/>
         </w:rPr>
-        <w:t>git config --global --</w:t>
-      </w:r>
-      <w:proofErr w:type="spellStart"/>
-      <w:r>
+        <w:t>git commit -m "Ajout des classes modèles (POO)"</w:t>
+      </w:r>
+    </w:p>
+    <w:p>
+      <w:pPr>
+        <w:pStyle w:val="NormalWeb"/>
+        <w:numPr>
+          <w:ilvl w:val="0"/>
+          <w:numId w:val="18"/>
+        </w:numPr>
         <w:rPr>
           <w:rFonts w:asciiTheme="minorHAnsi" w:eastAsiaTheme="minorHAnsi" w:hAnsiTheme="minorHAnsi" w:cstheme="minorBidi"/>
           <w:szCs w:val="22"/>
           <w:lang w:eastAsia="en-US"/>
         </w:rPr>
-        <w:t>list</w:t>
+      </w:pPr>
+      <w:r>
+        <w:rPr>
+          <w:rFonts w:asciiTheme="minorHAnsi" w:eastAsiaTheme="minorHAnsi" w:hAnsiTheme="minorHAnsi" w:cstheme="minorBidi"/>
+          <w:szCs w:val="22"/>
+          <w:lang w:eastAsia="en-US"/>
+        </w:rPr>
+        <w:t xml:space="preserve">git </w:t>
+      </w:r>
+      <w:proofErr w:type="spellStart"/>
+      <w:r>
+        <w:rPr>
+          <w:rFonts w:asciiTheme="minorHAnsi" w:eastAsiaTheme="minorHAnsi" w:hAnsiTheme="minorHAnsi" w:cstheme="minorBidi"/>
+          <w:szCs w:val="22"/>
+          <w:lang w:eastAsia="en-US"/>
+        </w:rPr>
+        <w:t>add</w:t>
       </w:r>
       <w:proofErr w:type="spellEnd"/>
+      <w:r>
+        <w:rPr>
+          <w:rFonts w:asciiTheme="minorHAnsi" w:eastAsiaTheme="minorHAnsi" w:hAnsiTheme="minorHAnsi" w:cstheme="minorBidi"/>
+          <w:szCs w:val="22"/>
+          <w:lang w:eastAsia="en-US"/>
+        </w:rPr>
+        <w:t xml:space="preserve"> </w:t>
+      </w:r>
+      <w:proofErr w:type="spellStart"/>
+      <w:r>
+        <w:rPr>
+          <w:rFonts w:asciiTheme="minorHAnsi" w:eastAsiaTheme="minorHAnsi" w:hAnsiTheme="minorHAnsi" w:cstheme="minorBidi"/>
+          <w:szCs w:val="22"/>
+          <w:lang w:eastAsia="en-US"/>
+        </w:rPr>
+        <w:t>streaming_app</w:t>
+      </w:r>
+      <w:proofErr w:type="spellEnd"/>
+      <w:r>
+        <w:rPr>
+          <w:rFonts w:asciiTheme="minorHAnsi" w:eastAsiaTheme="minorHAnsi" w:hAnsiTheme="minorHAnsi" w:cstheme="minorBidi"/>
+          <w:szCs w:val="22"/>
+          <w:lang w:eastAsia="en-US"/>
+        </w:rPr>
+        <w:t>/</w:t>
+      </w:r>
+      <w:proofErr w:type="spellStart"/>
+      <w:r>
+        <w:rPr>
+          <w:rFonts w:asciiTheme="minorHAnsi" w:eastAsiaTheme="minorHAnsi" w:hAnsiTheme="minorHAnsi" w:cstheme="minorBidi"/>
+          <w:szCs w:val="22"/>
+          <w:lang w:eastAsia="en-US"/>
+        </w:rPr>
+        <w:t>views</w:t>
+      </w:r>
+      <w:proofErr w:type="spellEnd"/>
+      <w:r>
+        <w:rPr>
+          <w:rFonts w:asciiTheme="minorHAnsi" w:eastAsiaTheme="minorHAnsi" w:hAnsiTheme="minorHAnsi" w:cstheme="minorBidi"/>
+          <w:szCs w:val="22"/>
+          <w:lang w:eastAsia="en-US"/>
+        </w:rPr>
+        <w:t>/</w:t>
+      </w:r>
+    </w:p>
+    <w:p>
+      <w:pPr>
+        <w:pStyle w:val="NormalWeb"/>
+        <w:numPr>
+          <w:ilvl w:val="0"/>
+          <w:numId w:val="18"/>
+        </w:numPr>
+        <w:rPr>
+          <w:rFonts w:asciiTheme="minorHAnsi" w:eastAsiaTheme="minorHAnsi" w:hAnsiTheme="minorHAnsi" w:cstheme="minorBidi"/>
+          <w:szCs w:val="22"/>
+          <w:lang w:eastAsia="en-US"/>
+        </w:rPr>
+      </w:pPr>
+      <w:r>
+        <w:rPr>
+          <w:rFonts w:asciiTheme="minorHAnsi" w:eastAsiaTheme="minorHAnsi" w:hAnsiTheme="minorHAnsi" w:cstheme="minorBidi"/>
+          <w:szCs w:val="22"/>
+          <w:lang w:eastAsia="en-US"/>
+        </w:rPr>
+        <w:t>git commit -m "Ajout des fenêtres de l'interface graphique"</w:t>
+      </w:r>
+    </w:p>
+    <w:p>
+      <w:pPr>
+        <w:pStyle w:val="NormalWeb"/>
+        <w:numPr>
+          <w:ilvl w:val="0"/>
+          <w:numId w:val="18"/>
+        </w:numPr>
+        <w:rPr>
+          <w:rFonts w:asciiTheme="minorHAnsi" w:eastAsiaTheme="minorHAnsi" w:hAnsiTheme="minorHAnsi" w:cstheme="minorBidi"/>
+          <w:szCs w:val="22"/>
+          <w:lang w:eastAsia="en-US"/>
+        </w:rPr>
+      </w:pPr>
+      <w:r>
+        <w:rPr>
+          <w:rFonts w:asciiTheme="minorHAnsi" w:eastAsiaTheme="minorHAnsi" w:hAnsiTheme="minorHAnsi" w:cstheme="minorBidi"/>
+          <w:szCs w:val="22"/>
+          <w:lang w:eastAsia="en-US"/>
+        </w:rPr>
+        <w:t xml:space="preserve">git </w:t>
+      </w:r>
+      <w:proofErr w:type="spellStart"/>
+      <w:r>
+        <w:rPr>
+          <w:rFonts w:asciiTheme="minorHAnsi" w:eastAsiaTheme="minorHAnsi" w:hAnsiTheme="minorHAnsi" w:cstheme="minorBidi"/>
+          <w:szCs w:val="22"/>
+          <w:lang w:eastAsia="en-US"/>
+        </w:rPr>
+        <w:t>add</w:t>
+      </w:r>
+      <w:proofErr w:type="spellEnd"/>
+      <w:r>
+        <w:rPr>
+          <w:rFonts w:asciiTheme="minorHAnsi" w:eastAsiaTheme="minorHAnsi" w:hAnsiTheme="minorHAnsi" w:cstheme="minorBidi"/>
+          <w:szCs w:val="22"/>
+          <w:lang w:eastAsia="en-US"/>
+        </w:rPr>
+        <w:t xml:space="preserve"> streaming_app/main.py</w:t>
+      </w:r>
+    </w:p>
+    <w:p>
+      <w:pPr>
+        <w:pStyle w:val="NormalWeb"/>
+        <w:numPr>
+          <w:ilvl w:val="0"/>
+          <w:numId w:val="18"/>
+        </w:numPr>
+        <w:rPr>
+          <w:rFonts w:asciiTheme="minorHAnsi" w:eastAsiaTheme="minorHAnsi" w:hAnsiTheme="minorHAnsi" w:cstheme="minorBidi"/>
+          <w:szCs w:val="22"/>
+          <w:lang w:eastAsia="en-US"/>
+        </w:rPr>
+      </w:pPr>
+      <w:r>
+        <w:rPr>
+          <w:rFonts w:asciiTheme="minorHAnsi" w:eastAsiaTheme="minorHAnsi" w:hAnsiTheme="minorHAnsi" w:cstheme="minorBidi"/>
+          <w:szCs w:val="22"/>
+          <w:lang w:eastAsia="en-US"/>
+        </w:rPr>
+        <w:t>git commit -m "Ajout du point d'entrée et des données de démonstration"</w:t>
+      </w:r>
+    </w:p>
+    <w:p>
+      <w:pPr>
+        <w:pStyle w:val="NormalWeb"/>
+        <w:numPr>
+          <w:ilvl w:val="0"/>
+          <w:numId w:val="18"/>
+        </w:numPr>
+        <w:rPr>
+          <w:rFonts w:asciiTheme="minorHAnsi" w:eastAsiaTheme="minorHAnsi" w:hAnsiTheme="minorHAnsi" w:cstheme="minorBidi"/>
+          <w:szCs w:val="22"/>
+          <w:lang w:eastAsia="en-US"/>
+        </w:rPr>
+      </w:pPr>
+      <w:r>
+        <w:t>git add streaming_app/utils.py</w:t>
+      </w:r>
+    </w:p>
+    <w:p>
+      <w:pPr>
+        <w:pStyle w:val="NormalWeb"/>
+        <w:numPr>
+          <w:ilvl w:val="0"/>
+          <w:numId w:val="18"/>
+        </w:numPr>
+        <w:rPr>
+          <w:rFonts w:asciiTheme="minorHAnsi" w:eastAsiaTheme="minorHAnsi" w:hAnsiTheme="minorHAnsi" w:cstheme="minorBidi"/>
+          <w:szCs w:val="22"/>
+          <w:lang w:eastAsia="en-US"/>
+        </w:rPr>
+      </w:pPr>
+      <w:r>
+        <w:t>git commit -m "Ajout du hashage SHA-256 des mots de passe (securite)"</w:t>
+      </w:r>
+    </w:p>
+    <w:p>
+      <w:pPr>
+        <w:pStyle w:val="NormalWeb"/>
+        <w:numPr>
+          <w:ilvl w:val="0"/>
+          <w:numId w:val="18"/>
+        </w:numPr>
+        <w:rPr>
+          <w:rFonts w:asciiTheme="minorHAnsi" w:eastAsiaTheme="minorHAnsi" w:hAnsiTheme="minorHAnsi" w:cstheme="minorBidi"/>
+          <w:szCs w:val="22"/>
+          <w:lang w:eastAsia="en-US"/>
+        </w:rPr>
+      </w:pPr>
+      <w:r>
+        <w:rPr>
+          <w:rFonts w:asciiTheme="minorHAnsi" w:eastAsiaTheme="minorHAnsi" w:hAnsiTheme="minorHAnsi" w:cstheme="minorBidi"/>
+          <w:szCs w:val="22"/>
+          <w:lang w:eastAsia="en-US"/>
+        </w:rPr>
+        <w:lastRenderedPageBreak/>
+        <w:t>git log --</w:t>
+      </w:r>
+      <w:proofErr w:type="spellStart"/>
+      <w:r>
+        <w:rPr>
+          <w:rFonts w:asciiTheme="minorHAnsi" w:eastAsiaTheme="minorHAnsi" w:hAnsiTheme="minorHAnsi" w:cstheme="minorBidi"/>
+          <w:szCs w:val="22"/>
+          <w:lang w:eastAsia="en-US"/>
+        </w:rPr>
+        <w:t>oneline</w:t>
+      </w:r>
+      <w:proofErr w:type="spellEnd"/>
+    </w:p>
+    <w:p>
+      <w:pPr>
+        <w:pStyle w:val="NormalWeb"/>
+        <w:numPr>
+          <w:ilvl w:val="0"/>
+          <w:numId w:val="18"/>
+        </w:numPr>
+        <w:rPr>
+          <w:rFonts w:asciiTheme="minorHAnsi" w:eastAsiaTheme="minorHAnsi" w:hAnsiTheme="minorHAnsi" w:cstheme="minorBidi"/>
+          <w:szCs w:val="22"/>
+          <w:lang w:eastAsia="en-US"/>
+        </w:rPr>
+      </w:pPr>
+      <w:r>
+        <w:rPr>
+          <w:rFonts w:asciiTheme="minorHAnsi" w:eastAsiaTheme="minorHAnsi" w:hAnsiTheme="minorHAnsi" w:cstheme="minorBidi"/>
+          <w:szCs w:val="22"/>
+          <w:lang w:eastAsia="en-US"/>
+        </w:rPr>
+        <w:t xml:space="preserve">git push </w:t>
+      </w:r>
+      <w:proofErr w:type="spellStart"/>
+      <w:r>
+        <w:rPr>
+          <w:rFonts w:asciiTheme="minorHAnsi" w:eastAsiaTheme="minorHAnsi" w:hAnsiTheme="minorHAnsi" w:cstheme="minorBidi"/>
+          <w:szCs w:val="22"/>
+          <w:lang w:eastAsia="en-US"/>
+        </w:rPr>
+        <w:t>origin</w:t>
+      </w:r>
+      <w:proofErr w:type="spellEnd"/>
+      <w:r>
+        <w:rPr>
+          <w:rFonts w:asciiTheme="minorHAnsi" w:eastAsiaTheme="minorHAnsi" w:hAnsiTheme="minorHAnsi" w:cstheme="minorBidi"/>
+          <w:szCs w:val="22"/>
+          <w:lang w:eastAsia="en-US"/>
+        </w:rPr>
+        <w:t xml:space="preserve"> main</w:t>
+      </w:r>
     </w:p>
     <w:p>
       <w:pPr>
@@ -1024,9 +1306,8 @@
           <w:noProof/>
           <w:szCs w:val="22"/>
         </w:rPr>
-        <w:lastRenderedPageBreak/>
         <w:drawing>
-          <wp:inline distT="0" distB="0" distL="0" distR="0" wp14:anchorId="1B54DDEF" wp14:editId="79C67B56">
+          <wp:inline distT="0" distB="0" distL="0" distR="0" wp14:anchorId="3FD58B82" wp14:editId="7E55CEAB">
             <wp:extent cx="5760720" cy="4391891"/>
             <wp:effectExtent l="0" t="0" r="0" b="8890"/>
             <wp:docPr id="4" name="Image 4"/>
@@ -1120,8 +1401,7 @@
       <w:pPr>
         <w:pStyle w:val="Lgende"/>
         <w:rPr>
-          <w:rFonts w:cstheme="minorHAnsi"/>
-          <w:highlight w:val="yellow"/>
+          <w:noProof/>
         </w:rPr>
       </w:pPr>
       <w:r>
@@ -1155,253 +1435,21 @@
     </w:p>
     <w:p>
       <w:pPr>
-        <w:pStyle w:val="NormalWeb"/>
-        <w:rPr>
-          <w:rFonts w:asciiTheme="minorHAnsi" w:hAnsiTheme="minorHAnsi" w:cstheme="minorHAnsi"/>
-        </w:rPr>
-      </w:pPr>
-      <w:r>
-        <w:rPr>
-          <w:rFonts w:asciiTheme="minorHAnsi" w:hAnsiTheme="minorHAnsi" w:cstheme="minorHAnsi"/>
-        </w:rPr>
-        <w:t>L’utilisation de Git permet :</w:t>
-      </w:r>
-    </w:p>
-    <w:p>
-      <w:pPr>
-        <w:pStyle w:val="NormalWeb"/>
-        <w:numPr>
-          <w:ilvl w:val="0"/>
-          <w:numId w:val="20"/>
-        </w:numPr>
-        <w:rPr>
-          <w:rFonts w:asciiTheme="minorHAnsi" w:hAnsiTheme="minorHAnsi" w:cstheme="minorHAnsi"/>
-        </w:rPr>
-      </w:pPr>
-      <w:r>
-        <w:rPr>
-          <w:rFonts w:asciiTheme="minorHAnsi" w:hAnsiTheme="minorHAnsi" w:cstheme="minorHAnsi"/>
-        </w:rPr>
-        <w:t>Le suivi des modifications</w:t>
-      </w:r>
-    </w:p>
-    <w:p>
-      <w:pPr>
-        <w:pStyle w:val="NormalWeb"/>
-        <w:numPr>
-          <w:ilvl w:val="0"/>
-          <w:numId w:val="20"/>
-        </w:numPr>
-        <w:rPr>
-          <w:rFonts w:asciiTheme="minorHAnsi" w:hAnsiTheme="minorHAnsi" w:cstheme="minorHAnsi"/>
-        </w:rPr>
-      </w:pPr>
-      <w:r>
-        <w:rPr>
-          <w:rFonts w:asciiTheme="minorHAnsi" w:hAnsiTheme="minorHAnsi" w:cstheme="minorHAnsi"/>
+        <w:rPr>
+          <w:highlight w:val="yellow"/>
+        </w:rPr>
+      </w:pPr>
+      <w:r>
+        <w:rPr>
+          <w:noProof/>
+          <w:lang w:eastAsia="fr-FR"/>
         </w:rPr>
         <w:lastRenderedPageBreak/>
-        <w:t>La sauvegarde progressive</w:t>
-      </w:r>
-    </w:p>
-    <w:p>
-      <w:pPr>
-        <w:pStyle w:val="NormalWeb"/>
-        <w:numPr>
-          <w:ilvl w:val="0"/>
-          <w:numId w:val="20"/>
-        </w:numPr>
-        <w:rPr>
-          <w:rFonts w:asciiTheme="minorHAnsi" w:hAnsiTheme="minorHAnsi" w:cstheme="minorHAnsi"/>
-        </w:rPr>
-      </w:pPr>
-      <w:r>
-        <w:rPr>
-          <w:rFonts w:asciiTheme="minorHAnsi" w:hAnsiTheme="minorHAnsi" w:cstheme="minorHAnsi"/>
-        </w:rPr>
-        <w:t>La gestion des versions du projet</w:t>
-      </w:r>
-    </w:p>
-    <w:p>
-      <w:pPr>
-        <w:pStyle w:val="Paragraphedeliste"/>
-        <w:numPr>
-          <w:ilvl w:val="0"/>
-          <w:numId w:val="1"/>
-        </w:numPr>
-        <w:jc w:val="both"/>
-        <w:rPr>
-          <w:b/>
-          <w:sz w:val="28"/>
-          <w:szCs w:val="24"/>
-        </w:rPr>
-      </w:pPr>
-      <w:r>
-        <w:rPr>
-          <w:b/>
-          <w:sz w:val="28"/>
-          <w:szCs w:val="24"/>
-        </w:rPr>
-        <w:t>Architecture du projet</w:t>
-      </w:r>
-    </w:p>
-    <w:p>
-      <w:pPr>
-        <w:rPr>
-          <w:sz w:val="24"/>
-        </w:rPr>
-      </w:pPr>
-      <w:r>
-        <w:rPr>
-          <w:sz w:val="24"/>
-        </w:rPr>
-        <w:t>L’application est structurée de manière modulaire :</w:t>
-      </w:r>
-    </w:p>
-    <w:p>
-      <w:pPr>
-        <w:rPr>
-          <w:sz w:val="24"/>
-        </w:rPr>
-      </w:pPr>
-      <w:r>
-        <w:rPr>
-          <w:sz w:val="24"/>
-        </w:rPr>
-        <w:t>L’architecture a été mise en place avant l’implémentation afin de structurer le projet selon une approche modulaire respectant la séparation des responsabilités.</w:t>
-      </w:r>
-      <w:r>
-        <w:rPr>
-          <w:sz w:val="24"/>
-        </w:rPr>
-        <w:t xml:space="preserve"> </w:t>
-      </w:r>
-    </w:p>
-    <w:p>
-      <w:pPr>
-        <w:pStyle w:val="Paragraphedeliste"/>
-        <w:numPr>
-          <w:ilvl w:val="0"/>
-          <w:numId w:val="22"/>
-        </w:numPr>
-        <w:rPr>
-          <w:sz w:val="24"/>
-        </w:rPr>
-      </w:pPr>
-      <w:proofErr w:type="spellStart"/>
-      <w:r>
-        <w:rPr>
-          <w:sz w:val="24"/>
-        </w:rPr>
-        <w:t>models</w:t>
-      </w:r>
-      <w:proofErr w:type="spellEnd"/>
-      <w:r>
-        <w:rPr>
-          <w:sz w:val="24"/>
-        </w:rPr>
-        <w:t xml:space="preserve"> → gestion des données et logique métier</w:t>
-      </w:r>
-    </w:p>
-    <w:p>
-      <w:pPr>
-        <w:pStyle w:val="Paragraphedeliste"/>
-        <w:numPr>
-          <w:ilvl w:val="0"/>
-          <w:numId w:val="22"/>
-        </w:numPr>
-        <w:rPr>
-          <w:sz w:val="24"/>
-        </w:rPr>
-      </w:pPr>
-      <w:proofErr w:type="spellStart"/>
-      <w:r>
-        <w:rPr>
-          <w:sz w:val="24"/>
-        </w:rPr>
-        <w:t>views</w:t>
-      </w:r>
-      <w:proofErr w:type="spellEnd"/>
-      <w:r>
-        <w:rPr>
-          <w:sz w:val="24"/>
-        </w:rPr>
-        <w:t xml:space="preserve"> → gestion des interfaces graphiques</w:t>
-      </w:r>
-    </w:p>
-    <w:p>
-      <w:pPr>
-        <w:pStyle w:val="Paragraphedeliste"/>
-        <w:numPr>
-          <w:ilvl w:val="0"/>
-          <w:numId w:val="22"/>
-        </w:numPr>
-        <w:rPr>
-          <w:sz w:val="24"/>
-        </w:rPr>
-      </w:pPr>
-      <w:r>
-        <w:rPr>
-          <w:sz w:val="24"/>
-        </w:rPr>
-        <w:t>main.py → point d’entrée de l’application</w:t>
-      </w:r>
-    </w:p>
-    <w:p>
-      <w:pPr>
-        <w:rPr>
-          <w:sz w:val="24"/>
-        </w:rPr>
-      </w:pPr>
-      <w:r>
-        <w:rPr>
-          <w:b/>
-          <w:sz w:val="24"/>
-        </w:rPr>
-        <w:t>__init__.py</w:t>
-      </w:r>
-      <w:r>
-        <w:rPr>
-          <w:sz w:val="24"/>
-        </w:rPr>
-        <w:t xml:space="preserve"> </w:t>
-      </w:r>
-      <w:r>
-        <w:rPr>
-          <w:sz w:val="24"/>
-        </w:rPr>
-        <w:t xml:space="preserve">permet à Python de </w:t>
-      </w:r>
-      <w:r>
-        <w:rPr>
-          <w:sz w:val="24"/>
-        </w:rPr>
-        <w:t>comprendre que c’est un package, m</w:t>
-      </w:r>
-      <w:r>
-        <w:rPr>
-          <w:sz w:val="24"/>
-        </w:rPr>
-        <w:t>ême vide, il est important.</w:t>
-      </w:r>
-    </w:p>
-    <w:p>
-      <w:pPr>
-        <w:rPr>
-          <w:sz w:val="24"/>
-        </w:rPr>
-      </w:pPr>
-      <w:r>
-        <w:rPr>
-          <w:noProof/>
-          <w:sz w:val="24"/>
-          <w:lang w:eastAsia="fr-FR"/>
-        </w:rPr>
         <w:drawing>
-          <wp:inline distT="0" distB="0" distL="0" distR="0" wp14:anchorId="7E5EA38A" wp14:editId="2802FAAF">
-            <wp:extent cx="2758679" cy="3932261"/>
-            <wp:effectExtent l="0" t="0" r="3810" b="0"/>
-            <wp:docPr id="7" name="Image 7"/>
+          <wp:inline distT="0" distB="0" distL="0" distR="0" wp14:anchorId="58EE05C8" wp14:editId="01AD31AC">
+            <wp:extent cx="5760720" cy="3834560"/>
+            <wp:effectExtent l="0" t="0" r="0" b="0"/>
+            <wp:docPr id="14" name="Image 14"/>
             <wp:cNvGraphicFramePr>
               <a:graphicFrameLocks xmlns:a="http://schemas.openxmlformats.org/drawingml/2006/main" noChangeAspect="1"/>
             </wp:cNvGraphicFramePr>
@@ -1421,7 +1469,7 @@
                   <pic:spPr>
                     <a:xfrm>
                       <a:off x="0" y="0"/>
-                      <a:ext cx="2758679" cy="3932261"/>
+                      <a:ext cx="5760720" cy="3834560"/>
                     </a:xfrm>
                     <a:prstGeom prst="rect">
                       <a:avLst/>
@@ -1436,175 +1484,89 @@
     </w:p>
     <w:p>
       <w:pPr>
-        <w:pStyle w:val="Paragraphedeliste"/>
+        <w:pStyle w:val="NormalWeb"/>
+        <w:rPr>
+          <w:rFonts w:asciiTheme="minorHAnsi" w:hAnsiTheme="minorHAnsi" w:cstheme="minorHAnsi"/>
+        </w:rPr>
+      </w:pPr>
+      <w:r>
+        <w:rPr>
+          <w:rFonts w:asciiTheme="minorHAnsi" w:hAnsiTheme="minorHAnsi" w:cstheme="minorHAnsi"/>
+        </w:rPr>
+        <w:t>L’utilisation de Git permet :</w:t>
+      </w:r>
+    </w:p>
+    <w:p>
+      <w:pPr>
+        <w:pStyle w:val="NormalWeb"/>
         <w:numPr>
           <w:ilvl w:val="0"/>
-          <w:numId w:val="1"/>
+          <w:numId w:val="20"/>
         </w:numPr>
-        <w:jc w:val="both"/>
-        <w:rPr>
-          <w:b/>
-          <w:sz w:val="28"/>
-          <w:szCs w:val="24"/>
-        </w:rPr>
-      </w:pPr>
-      <w:r>
-        <w:rPr>
-          <w:b/>
-          <w:sz w:val="28"/>
-          <w:szCs w:val="24"/>
-        </w:rPr>
-        <w:t>Description de l’application (Étape 3)</w:t>
-      </w:r>
-    </w:p>
-    <w:p>
-      <w:pPr>
-        <w:pStyle w:val="Paragraphedeliste"/>
+        <w:rPr>
+          <w:rFonts w:asciiTheme="minorHAnsi" w:hAnsiTheme="minorHAnsi" w:cstheme="minorHAnsi"/>
+        </w:rPr>
+      </w:pPr>
+      <w:r>
+        <w:rPr>
+          <w:rFonts w:asciiTheme="minorHAnsi" w:hAnsiTheme="minorHAnsi" w:cstheme="minorHAnsi"/>
+        </w:rPr>
+        <w:t>Le suivi des modifications</w:t>
+      </w:r>
+    </w:p>
+    <w:p>
+      <w:pPr>
+        <w:pStyle w:val="NormalWeb"/>
         <w:numPr>
           <w:ilvl w:val="0"/>
-          <w:numId w:val="24"/>
+          <w:numId w:val="20"/>
         </w:numPr>
         <w:rPr>
-          <w:b/>
-          <w:sz w:val="24"/>
-        </w:rPr>
-      </w:pPr>
-      <w:r>
-        <w:rPr>
-          <w:b/>
-          <w:sz w:val="24"/>
-        </w:rPr>
-        <w:t>Fenêtre de connexion</w:t>
-      </w:r>
-    </w:p>
-    <w:p>
-      <w:pPr>
-        <w:rPr>
-          <w:sz w:val="24"/>
-        </w:rPr>
-      </w:pPr>
-      <w:r>
-        <w:rPr>
-          <w:sz w:val="24"/>
-        </w:rPr>
-        <w:t>Au dém</w:t>
-      </w:r>
-      <w:r>
-        <w:rPr>
-          <w:sz w:val="24"/>
-        </w:rPr>
-        <w:t>arrage, l’employé doit entrer :</w:t>
-      </w:r>
-    </w:p>
-    <w:p>
-      <w:pPr>
-        <w:pStyle w:val="Paragraphedeliste"/>
+          <w:rFonts w:asciiTheme="minorHAnsi" w:hAnsiTheme="minorHAnsi" w:cstheme="minorHAnsi"/>
+        </w:rPr>
+      </w:pPr>
+      <w:r>
+        <w:rPr>
+          <w:rFonts w:asciiTheme="minorHAnsi" w:hAnsiTheme="minorHAnsi" w:cstheme="minorHAnsi"/>
+        </w:rPr>
+        <w:t>La sauvegarde progressive</w:t>
+      </w:r>
+    </w:p>
+    <w:p>
+      <w:pPr>
+        <w:pStyle w:val="NormalWeb"/>
         <w:numPr>
           <w:ilvl w:val="0"/>
-          <w:numId w:val="25"/>
+          <w:numId w:val="20"/>
         </w:numPr>
         <w:rPr>
-          <w:sz w:val="24"/>
-        </w:rPr>
-      </w:pPr>
-      <w:r>
-        <w:rPr>
-          <w:sz w:val="24"/>
-        </w:rPr>
-        <w:t>Code utilisateur</w:t>
-      </w:r>
-    </w:p>
-    <w:p>
-      <w:pPr>
-        <w:pStyle w:val="Paragraphedeliste"/>
-        <w:numPr>
-          <w:ilvl w:val="0"/>
-          <w:numId w:val="25"/>
-        </w:numPr>
-        <w:rPr>
-          <w:sz w:val="24"/>
-        </w:rPr>
-      </w:pPr>
-      <w:r>
-        <w:rPr>
-          <w:sz w:val="24"/>
-        </w:rPr>
-        <w:t>Mot de passe (masqué)</w:t>
-      </w:r>
-    </w:p>
-    <w:p>
-      <w:pPr>
-        <w:rPr>
-          <w:sz w:val="24"/>
-        </w:rPr>
-      </w:pPr>
-      <w:r>
-        <w:rPr>
-          <w:sz w:val="24"/>
-        </w:rPr>
-        <w:t>Deux t</w:t>
-      </w:r>
-      <w:r>
-        <w:rPr>
-          <w:sz w:val="24"/>
-        </w:rPr>
-        <w:t>ypes d’accès sont implémentés :</w:t>
-      </w:r>
-    </w:p>
-    <w:p>
-      <w:pPr>
-        <w:pStyle w:val="Paragraphedeliste"/>
-        <w:numPr>
-          <w:ilvl w:val="0"/>
-          <w:numId w:val="26"/>
-        </w:numPr>
-        <w:rPr>
-          <w:sz w:val="24"/>
-        </w:rPr>
-      </w:pPr>
-      <w:r>
-        <w:rPr>
-          <w:sz w:val="24"/>
-        </w:rPr>
-        <w:t>Accès total</w:t>
-      </w:r>
-    </w:p>
-    <w:p>
-      <w:pPr>
-        <w:pStyle w:val="Paragraphedeliste"/>
-        <w:numPr>
-          <w:ilvl w:val="0"/>
-          <w:numId w:val="26"/>
-        </w:numPr>
-        <w:rPr>
-          <w:sz w:val="24"/>
-        </w:rPr>
-      </w:pPr>
-      <w:r>
-        <w:rPr>
-          <w:sz w:val="24"/>
-        </w:rPr>
-        <w:lastRenderedPageBreak/>
-        <w:t>Accès lecture (consultation uniquement)</w:t>
-      </w:r>
-    </w:p>
-    <w:p>
-      <w:pPr>
-        <w:rPr>
-          <w:sz w:val="24"/>
-        </w:rPr>
-      </w:pPr>
-      <w:r>
-        <w:rPr>
+          <w:rFonts w:asciiTheme="minorHAnsi" w:hAnsiTheme="minorHAnsi" w:cstheme="minorHAnsi"/>
+        </w:rPr>
+      </w:pPr>
+      <w:r>
+        <w:rPr>
+          <w:rFonts w:asciiTheme="minorHAnsi" w:hAnsiTheme="minorHAnsi" w:cstheme="minorHAnsi"/>
+        </w:rPr>
+        <w:t>La gestion des versions du projet</w:t>
+      </w:r>
+    </w:p>
+    <w:p>
+      <w:pPr>
+        <w:pStyle w:val="NormalWeb"/>
+        <w:rPr>
+          <w:rFonts w:asciiTheme="minorHAnsi" w:hAnsiTheme="minorHAnsi" w:cstheme="minorHAnsi"/>
+        </w:rPr>
+      </w:pPr>
+      <w:r>
+        <w:rPr>
+          <w:rFonts w:asciiTheme="minorHAnsi" w:hAnsiTheme="minorHAnsi" w:cstheme="minorHAnsi"/>
           <w:noProof/>
-          <w:sz w:val="24"/>
-          <w:lang w:eastAsia="fr-FR"/>
         </w:rPr>
         <w:drawing>
-          <wp:inline distT="0" distB="0" distL="0" distR="0" wp14:anchorId="5C438617" wp14:editId="257BFE9E">
-            <wp:extent cx="4732430" cy="3048264"/>
+          <wp:inline distT="0" distB="0" distL="0" distR="0" wp14:anchorId="0DE86FBC" wp14:editId="6E9C3B44">
+            <wp:extent cx="5760720" cy="2598632"/>
             <wp:effectExtent l="0" t="0" r="0" b="0"/>
-            <wp:docPr id="8" name="Image 8"/>
+            <wp:docPr id="16" name="Image 16"/>
             <wp:cNvGraphicFramePr>
               <a:graphicFrameLocks xmlns:a="http://schemas.openxmlformats.org/drawingml/2006/main" noChangeAspect="1"/>
             </wp:cNvGraphicFramePr>
@@ -1624,7 +1586,7 @@
                   <pic:spPr>
                     <a:xfrm>
                       <a:off x="0" y="0"/>
-                      <a:ext cx="4732430" cy="3048264"/>
+                      <a:ext cx="5760720" cy="2598632"/>
                     </a:xfrm>
                     <a:prstGeom prst="rect">
                       <a:avLst/>
@@ -1639,6 +1601,185 @@
     </w:p>
     <w:p>
       <w:pPr>
+        <w:pStyle w:val="Paragraphedeliste"/>
+        <w:numPr>
+          <w:ilvl w:val="0"/>
+          <w:numId w:val="1"/>
+        </w:numPr>
+        <w:jc w:val="both"/>
+        <w:rPr>
+          <w:b/>
+          <w:sz w:val="28"/>
+          <w:szCs w:val="24"/>
+        </w:rPr>
+      </w:pPr>
+      <w:r>
+        <w:rPr>
+          <w:b/>
+          <w:sz w:val="28"/>
+          <w:szCs w:val="24"/>
+        </w:rPr>
+        <w:t>Architecture du projet</w:t>
+      </w:r>
+    </w:p>
+    <w:p>
+      <w:pPr>
+        <w:rPr>
+          <w:sz w:val="24"/>
+        </w:rPr>
+      </w:pPr>
+      <w:r>
+        <w:rPr>
+          <w:sz w:val="24"/>
+        </w:rPr>
+        <w:t>L’application est structurée de manière modulaire :</w:t>
+      </w:r>
+    </w:p>
+    <w:p>
+      <w:pPr>
+        <w:rPr>
+          <w:sz w:val="24"/>
+        </w:rPr>
+      </w:pPr>
+      <w:r>
+        <w:rPr>
+          <w:sz w:val="24"/>
+        </w:rPr>
+        <w:t>L’architecture a été mise en place avant l’implémentation afin de structurer le projet selon une approche modulaire respectant la séparation des responsabilités.</w:t>
+      </w:r>
+      <w:r>
+        <w:rPr>
+          <w:sz w:val="24"/>
+        </w:rPr>
+        <w:t xml:space="preserve"> </w:t>
+      </w:r>
+    </w:p>
+    <w:p>
+      <w:pPr>
+        <w:pStyle w:val="Paragraphedeliste"/>
+        <w:numPr>
+          <w:ilvl w:val="0"/>
+          <w:numId w:val="22"/>
+        </w:numPr>
+        <w:rPr>
+          <w:sz w:val="24"/>
+        </w:rPr>
+      </w:pPr>
+      <w:proofErr w:type="spellStart"/>
+      <w:r>
+        <w:rPr>
+          <w:sz w:val="24"/>
+        </w:rPr>
+        <w:lastRenderedPageBreak/>
+        <w:t>models</w:t>
+      </w:r>
+      <w:proofErr w:type="spellEnd"/>
+      <w:r>
+        <w:rPr>
+          <w:sz w:val="24"/>
+        </w:rPr>
+        <w:t xml:space="preserve"> → gestion des données et logique métier</w:t>
+      </w:r>
+    </w:p>
+    <w:p>
+      <w:pPr>
+        <w:pStyle w:val="Paragraphedeliste"/>
+        <w:numPr>
+          <w:ilvl w:val="0"/>
+          <w:numId w:val="22"/>
+        </w:numPr>
+        <w:rPr>
+          <w:sz w:val="24"/>
+        </w:rPr>
+      </w:pPr>
+      <w:proofErr w:type="spellStart"/>
+      <w:r>
+        <w:rPr>
+          <w:sz w:val="24"/>
+        </w:rPr>
+        <w:t>views</w:t>
+      </w:r>
+      <w:proofErr w:type="spellEnd"/>
+      <w:r>
+        <w:rPr>
+          <w:sz w:val="24"/>
+        </w:rPr>
+        <w:t xml:space="preserve"> → gestion des interfaces graphiques</w:t>
+      </w:r>
+    </w:p>
+    <w:p>
+      <w:pPr>
+        <w:pStyle w:val="Paragraphedeliste"/>
+        <w:numPr>
+          <w:ilvl w:val="0"/>
+          <w:numId w:val="22"/>
+        </w:numPr>
+        <w:rPr>
+          <w:sz w:val="24"/>
+        </w:rPr>
+      </w:pPr>
+      <w:r>
+        <w:rPr>
+          <w:sz w:val="24"/>
+        </w:rPr>
+        <w:t>main.py → point d’entrée de l’application</w:t>
+      </w:r>
+    </w:p>
+    <w:p>
+      <w:pPr>
+        <w:pStyle w:val="Paragraphedeliste"/>
+        <w:numPr>
+          <w:ilvl w:val="0"/>
+          <w:numId w:val="22"/>
+        </w:numPr>
+        <w:rPr>
+          <w:sz w:val="24"/>
+        </w:rPr>
+      </w:pPr>
+      <w:r>
+        <w:t>utils.py → fonctions utilitaires (hashage SHA-256)</w:t>
+      </w:r>
+    </w:p>
+    <w:p>
+      <w:pPr>
+        <w:rPr>
+          <w:sz w:val="24"/>
+        </w:rPr>
+      </w:pPr>
+      <w:r>
+        <w:rPr>
+          <w:b/>
+          <w:sz w:val="24"/>
+        </w:rPr>
+        <w:t>__init__.py</w:t>
+      </w:r>
+      <w:r>
+        <w:rPr>
+          <w:sz w:val="24"/>
+        </w:rPr>
+        <w:t xml:space="preserve"> </w:t>
+      </w:r>
+      <w:r>
+        <w:rPr>
+          <w:sz w:val="24"/>
+        </w:rPr>
+        <w:t xml:space="preserve">permet à Python de </w:t>
+      </w:r>
+      <w:r>
+        <w:rPr>
+          <w:sz w:val="24"/>
+        </w:rPr>
+        <w:t>comprendre que c’est un package, m</w:t>
+      </w:r>
+      <w:r>
+        <w:rPr>
+          <w:sz w:val="24"/>
+        </w:rPr>
+        <w:t>ême vide, il est important.</w:t>
+      </w:r>
+    </w:p>
+    <w:p>
+      <w:pPr>
         <w:rPr>
           <w:sz w:val="24"/>
         </w:rPr>
@@ -1650,10 +1791,10 @@
           <w:lang w:eastAsia="fr-FR"/>
         </w:rPr>
         <w:drawing>
-          <wp:inline distT="0" distB="0" distL="0" distR="0" wp14:anchorId="0C6CB8C7" wp14:editId="16EDFBF9">
-            <wp:extent cx="4839119" cy="4740051"/>
-            <wp:effectExtent l="0" t="0" r="0" b="3810"/>
-            <wp:docPr id="9" name="Image 9"/>
+          <wp:inline distT="0" distB="0" distL="0" distR="0" wp14:anchorId="7E5EA38A" wp14:editId="2802FAAF">
+            <wp:extent cx="2758679" cy="3932261"/>
+            <wp:effectExtent l="0" t="0" r="3810" b="0"/>
+            <wp:docPr id="7" name="Image 7"/>
             <wp:cNvGraphicFramePr>
               <a:graphicFrameLocks xmlns:a="http://schemas.openxmlformats.org/drawingml/2006/main" noChangeAspect="1"/>
             </wp:cNvGraphicFramePr>
@@ -1673,7 +1814,7 @@
                   <pic:spPr>
                     <a:xfrm>
                       <a:off x="0" y="0"/>
-                      <a:ext cx="4839119" cy="4740051"/>
+                      <a:ext cx="2758679" cy="3932261"/>
                     </a:xfrm>
                     <a:prstGeom prst="rect">
                       <a:avLst/>
@@ -1691,46 +1832,22 @@
         <w:pStyle w:val="Paragraphedeliste"/>
         <w:numPr>
           <w:ilvl w:val="0"/>
-          <w:numId w:val="24"/>
+          <w:numId w:val="1"/>
         </w:numPr>
+        <w:jc w:val="both"/>
         <w:rPr>
           <w:b/>
-          <w:sz w:val="24"/>
+          <w:sz w:val="28"/>
+          <w:szCs w:val="24"/>
         </w:rPr>
       </w:pPr>
       <w:r>
         <w:rPr>
           <w:b/>
-          <w:sz w:val="24"/>
-        </w:rPr>
-        <w:t>Fenêtre principale</w:t>
-      </w:r>
-    </w:p>
-    <w:p>
-      <w:pPr>
-        <w:rPr>
-          <w:sz w:val="24"/>
-        </w:rPr>
-      </w:pPr>
-      <w:r>
-        <w:rPr>
-          <w:sz w:val="24"/>
-        </w:rPr>
-        <w:t>Après connexion :</w:t>
-      </w:r>
-    </w:p>
-    <w:p>
-      <w:pPr>
-        <w:rPr>
-          <w:sz w:val="24"/>
-        </w:rPr>
-      </w:pPr>
-      <w:r>
-        <w:rPr>
-          <w:sz w:val="24"/>
-        </w:rPr>
-        <w:lastRenderedPageBreak/>
-        <w:t>Affichage :</w:t>
+          <w:sz w:val="28"/>
+          <w:szCs w:val="24"/>
+        </w:rPr>
+        <w:t>Description de l’application (Étape 3)</w:t>
       </w:r>
     </w:p>
     <w:p>
@@ -1738,17 +1855,38 @@
         <w:pStyle w:val="Paragraphedeliste"/>
         <w:numPr>
           <w:ilvl w:val="0"/>
-          <w:numId w:val="27"/>
+          <w:numId w:val="24"/>
         </w:numPr>
         <w:rPr>
-          <w:sz w:val="24"/>
-        </w:rPr>
-      </w:pPr>
-      <w:r>
-        <w:rPr>
-          <w:sz w:val="24"/>
-        </w:rPr>
-        <w:t>Liste des clients (nom, prénom, courriel)</w:t>
+          <w:b/>
+          <w:sz w:val="24"/>
+        </w:rPr>
+      </w:pPr>
+      <w:r>
+        <w:rPr>
+          <w:b/>
+          <w:sz w:val="24"/>
+        </w:rPr>
+        <w:t>Fenêtre de connexion</w:t>
+      </w:r>
+    </w:p>
+    <w:p>
+      <w:pPr>
+        <w:rPr>
+          <w:sz w:val="24"/>
+        </w:rPr>
+      </w:pPr>
+      <w:r>
+        <w:rPr>
+          <w:sz w:val="24"/>
+        </w:rPr>
+        <w:t>Au dém</w:t>
+      </w:r>
+      <w:r>
+        <w:rPr>
+          <w:sz w:val="24"/>
+        </w:rPr>
+        <w:t>arrage, l’employé doit entrer :</w:t>
       </w:r>
     </w:p>
     <w:p>
@@ -1756,7 +1894,7 @@
         <w:pStyle w:val="Paragraphedeliste"/>
         <w:numPr>
           <w:ilvl w:val="0"/>
-          <w:numId w:val="27"/>
+          <w:numId w:val="25"/>
         </w:numPr>
         <w:rPr>
           <w:sz w:val="24"/>
@@ -1766,7 +1904,7 @@
         <w:rPr>
           <w:sz w:val="24"/>
         </w:rPr>
-        <w:t>Liste des films (nom, durée, catégories)</w:t>
+        <w:t>Code utilisateur</w:t>
       </w:r>
     </w:p>
     <w:p>
@@ -1774,7 +1912,7 @@
         <w:pStyle w:val="Paragraphedeliste"/>
         <w:numPr>
           <w:ilvl w:val="0"/>
-          <w:numId w:val="27"/>
+          <w:numId w:val="25"/>
         </w:numPr>
         <w:rPr>
           <w:sz w:val="24"/>
@@ -1784,20 +1922,26 @@
         <w:rPr>
           <w:sz w:val="24"/>
         </w:rPr>
-        <w:t>Affichage des acteurs associés</w:t>
-      </w:r>
-    </w:p>
-    <w:p>
-      <w:pPr>
-        <w:rPr>
-          <w:sz w:val="24"/>
-        </w:rPr>
-      </w:pPr>
-      <w:r>
-        <w:rPr>
-          <w:sz w:val="24"/>
-        </w:rPr>
-        <w:t>Fonctionnalités :</w:t>
+        <w:t>Mot de passe (masqué)</w:t>
+      </w:r>
+    </w:p>
+    <w:p>
+      <w:pPr>
+        <w:rPr>
+          <w:sz w:val="24"/>
+        </w:rPr>
+      </w:pPr>
+      <w:r>
+        <w:rPr>
+          <w:sz w:val="24"/>
+        </w:rPr>
+        <w:t>Deux t</w:t>
+      </w:r>
+      <w:r>
+        <w:rPr>
+          <w:sz w:val="24"/>
+        </w:rPr>
+        <w:t>ypes d’accès sont implémentés :</w:t>
       </w:r>
     </w:p>
     <w:p>
@@ -1805,7 +1949,7 @@
         <w:pStyle w:val="Paragraphedeliste"/>
         <w:numPr>
           <w:ilvl w:val="0"/>
-          <w:numId w:val="28"/>
+          <w:numId w:val="26"/>
         </w:numPr>
         <w:rPr>
           <w:sz w:val="24"/>
@@ -1815,7 +1959,7 @@
         <w:rPr>
           <w:sz w:val="24"/>
         </w:rPr>
-        <w:t>Création client</w:t>
+        <w:t>Accès total</w:t>
       </w:r>
     </w:p>
     <w:p>
@@ -1823,7 +1967,7 @@
         <w:pStyle w:val="Paragraphedeliste"/>
         <w:numPr>
           <w:ilvl w:val="0"/>
-          <w:numId w:val="28"/>
+          <w:numId w:val="26"/>
         </w:numPr>
         <w:rPr>
           <w:sz w:val="24"/>
@@ -1833,78 +1977,25 @@
         <w:rPr>
           <w:sz w:val="24"/>
         </w:rPr>
-        <w:t>Modification client</w:t>
-      </w:r>
-    </w:p>
-    <w:p>
-      <w:pPr>
-        <w:pStyle w:val="Paragraphedeliste"/>
-        <w:numPr>
-          <w:ilvl w:val="0"/>
-          <w:numId w:val="28"/>
-        </w:numPr>
-        <w:rPr>
-          <w:sz w:val="24"/>
-        </w:rPr>
-      </w:pPr>
-      <w:r>
-        <w:rPr>
-          <w:sz w:val="24"/>
-        </w:rPr>
-        <w:t>Suppression client</w:t>
-      </w:r>
-    </w:p>
-    <w:p>
-      <w:pPr>
-        <w:pStyle w:val="Paragraphedeliste"/>
-        <w:numPr>
-          <w:ilvl w:val="0"/>
-          <w:numId w:val="28"/>
-        </w:numPr>
-        <w:rPr>
-          <w:sz w:val="24"/>
-        </w:rPr>
-      </w:pPr>
-      <w:r>
-        <w:rPr>
-          <w:sz w:val="24"/>
-        </w:rPr>
-        <w:t>Déconnexion</w:t>
-      </w:r>
-    </w:p>
-    <w:p>
-      <w:pPr>
-        <w:pStyle w:val="Paragraphedeliste"/>
-        <w:numPr>
-          <w:ilvl w:val="0"/>
-          <w:numId w:val="28"/>
-        </w:numPr>
-        <w:rPr>
-          <w:sz w:val="24"/>
-        </w:rPr>
-      </w:pPr>
-      <w:r>
-        <w:rPr>
-          <w:sz w:val="24"/>
-        </w:rPr>
-        <w:t>Quitter</w:t>
-      </w:r>
-    </w:p>
-    <w:p>
-      <w:pPr>
-        <w:rPr>
-          <w:sz w:val="24"/>
-        </w:rPr>
-      </w:pPr>
-      <w:r>
-        <w:rPr>
-          <w:sz w:val="24"/>
-        </w:rPr>
+        <w:t>Accès lecture (consultation uniquement)</w:t>
+      </w:r>
+    </w:p>
+    <w:p>
+      <w:pPr>
+        <w:keepNext/>
+      </w:pPr>
+      <w:r>
+        <w:rPr>
+          <w:noProof/>
+          <w:sz w:val="24"/>
+          <w:lang w:eastAsia="fr-FR"/>
+        </w:rPr>
+        <w:lastRenderedPageBreak/>
         <w:drawing>
-          <wp:inline distT="0" distB="0" distL="0" distR="0" wp14:anchorId="6C338E2A" wp14:editId="7F54F47B">
-            <wp:extent cx="5760720" cy="4321459"/>
-            <wp:effectExtent l="0" t="0" r="0" b="3175"/>
-            <wp:docPr id="2" name="Image 2"/>
+          <wp:inline distT="0" distB="0" distL="0" distR="0" wp14:anchorId="37467AF9" wp14:editId="25E86705">
+            <wp:extent cx="4732430" cy="3048264"/>
+            <wp:effectExtent l="0" t="0" r="0" b="0"/>
+            <wp:docPr id="8" name="Image 8"/>
             <wp:cNvGraphicFramePr>
               <a:graphicFrameLocks xmlns:a="http://schemas.openxmlformats.org/drawingml/2006/main" noChangeAspect="1"/>
             </wp:cNvGraphicFramePr>
@@ -1924,7 +2015,7 @@
                   <pic:spPr>
                     <a:xfrm>
                       <a:off x="0" y="0"/>
-                      <a:ext cx="5760720" cy="4321459"/>
+                      <a:ext cx="4732430" cy="3048264"/>
                     </a:xfrm>
                     <a:prstGeom prst="rect">
                       <a:avLst/>
@@ -1939,136 +2030,44 @@
     </w:p>
     <w:p>
       <w:pPr>
-        <w:pStyle w:val="Paragraphedeliste"/>
-        <w:numPr>
-          <w:ilvl w:val="0"/>
-          <w:numId w:val="24"/>
-        </w:numPr>
-        <w:rPr>
-          <w:b/>
-          <w:sz w:val="24"/>
-        </w:rPr>
-      </w:pPr>
-      <w:r>
-        <w:rPr>
-          <w:b/>
-          <w:sz w:val="24"/>
-        </w:rPr>
-        <w:t>Création d’un client</w:t>
-      </w:r>
-    </w:p>
-    <w:p>
-      <w:pPr>
-        <w:rPr>
-          <w:sz w:val="24"/>
-        </w:rPr>
-      </w:pPr>
-      <w:r>
-        <w:rPr>
-          <w:sz w:val="24"/>
-        </w:rPr>
-        <w:t>Validation effectuée :</w:t>
-      </w:r>
-    </w:p>
-    <w:p>
-      <w:pPr>
-        <w:pStyle w:val="Paragraphedeliste"/>
-        <w:numPr>
-          <w:ilvl w:val="0"/>
-          <w:numId w:val="29"/>
-        </w:numPr>
-        <w:rPr>
-          <w:sz w:val="24"/>
-        </w:rPr>
-      </w:pPr>
-      <w:r>
-        <w:rPr>
-          <w:sz w:val="24"/>
-        </w:rPr>
-        <w:t>Courriel unique</w:t>
-      </w:r>
-    </w:p>
-    <w:p>
-      <w:pPr>
-        <w:pStyle w:val="Paragraphedeliste"/>
-        <w:numPr>
-          <w:ilvl w:val="0"/>
-          <w:numId w:val="29"/>
-        </w:numPr>
-        <w:rPr>
-          <w:sz w:val="24"/>
-        </w:rPr>
-      </w:pPr>
-      <w:r>
-        <w:rPr>
-          <w:sz w:val="24"/>
-        </w:rPr>
-        <w:t>Mot de passe minimum 8 caractères</w:t>
-      </w:r>
-    </w:p>
-    <w:p>
-      <w:pPr>
-        <w:pStyle w:val="Paragraphedeliste"/>
-        <w:numPr>
-          <w:ilvl w:val="0"/>
-          <w:numId w:val="29"/>
-        </w:numPr>
-        <w:rPr>
-          <w:sz w:val="24"/>
-        </w:rPr>
-      </w:pPr>
-      <w:r>
-        <w:rPr>
-          <w:sz w:val="24"/>
-        </w:rPr>
-        <w:t xml:space="preserve">Gestion des erreurs avec </w:t>
-      </w:r>
-      <w:proofErr w:type="spellStart"/>
-      <w:r>
-        <w:rPr>
-          <w:sz w:val="24"/>
-        </w:rPr>
-        <w:t>try</w:t>
-      </w:r>
-      <w:proofErr w:type="spellEnd"/>
-      <w:r>
-        <w:rPr>
-          <w:sz w:val="24"/>
-        </w:rPr>
-        <w:t>/</w:t>
-      </w:r>
-      <w:proofErr w:type="spellStart"/>
-      <w:r>
-        <w:rPr>
-          <w:sz w:val="24"/>
-        </w:rPr>
-        <w:t>except</w:t>
-      </w:r>
-      <w:proofErr w:type="spellEnd"/>
-    </w:p>
-    <w:p>
-      <w:pPr>
-        <w:rPr>
-          <w:sz w:val="24"/>
-        </w:rPr>
-      </w:pPr>
-    </w:p>
-    <w:p>
-      <w:pPr>
-        <w:rPr>
-          <w:sz w:val="24"/>
-        </w:rPr>
-      </w:pPr>
-      <w:r>
-        <w:rPr>
-          <w:sz w:val="24"/>
-        </w:rPr>
-        <w:lastRenderedPageBreak/>
+        <w:pStyle w:val="Lgende"/>
+        <w:rPr>
+          <w:sz w:val="24"/>
+        </w:rPr>
+      </w:pPr>
+      <w:r>
+        <w:t xml:space="preserve">Figure </w:t>
+      </w:r>
+      <w:fldSimple w:instr=" SEQ Figure \* ARABIC ">
+        <w:r>
+          <w:rPr>
+            <w:noProof/>
+          </w:rPr>
+          <w:t>3</w:t>
+        </w:r>
+      </w:fldSimple>
+      <w:r>
+        <w:t xml:space="preserve">: </w:t>
+      </w:r>
+      <w:r>
+        <w:t>Fenêtre de connexion</w:t>
+      </w:r>
+    </w:p>
+    <w:p>
+      <w:pPr>
+        <w:keepNext/>
+      </w:pPr>
+      <w:r>
+        <w:rPr>
+          <w:noProof/>
+          <w:sz w:val="24"/>
+          <w:lang w:eastAsia="fr-FR"/>
+        </w:rPr>
         <w:drawing>
-          <wp:inline distT="0" distB="0" distL="0" distR="0" wp14:anchorId="4F4C70BE" wp14:editId="2DE9F8DA">
-            <wp:extent cx="5760720" cy="4170796"/>
-            <wp:effectExtent l="0" t="0" r="0" b="1270"/>
-            <wp:docPr id="3" name="Image 3"/>
+          <wp:inline distT="0" distB="0" distL="0" distR="0" wp14:anchorId="2385595B" wp14:editId="4DC1CEAD">
+            <wp:extent cx="3596952" cy="4092295"/>
+            <wp:effectExtent l="0" t="0" r="3810" b="3810"/>
+            <wp:docPr id="11" name="Image 11"/>
             <wp:cNvGraphicFramePr>
               <a:graphicFrameLocks xmlns:a="http://schemas.openxmlformats.org/drawingml/2006/main" noChangeAspect="1"/>
             </wp:cNvGraphicFramePr>
@@ -2088,7 +2087,7 @@
                   <pic:spPr>
                     <a:xfrm>
                       <a:off x="0" y="0"/>
-                      <a:ext cx="5760720" cy="4170796"/>
+                      <a:ext cx="3596952" cy="4092295"/>
                     </a:xfrm>
                     <a:prstGeom prst="rect">
                       <a:avLst/>
@@ -2103,96 +2102,45 @@
     </w:p>
     <w:p>
       <w:pPr>
-        <w:pStyle w:val="Paragraphedeliste"/>
-        <w:numPr>
-          <w:ilvl w:val="0"/>
-          <w:numId w:val="24"/>
-        </w:numPr>
-        <w:rPr>
-          <w:b/>
-          <w:sz w:val="24"/>
-        </w:rPr>
-      </w:pPr>
-      <w:r>
-        <w:rPr>
-          <w:b/>
-          <w:sz w:val="24"/>
-        </w:rPr>
-        <w:t>Modification d’un client</w:t>
-      </w:r>
-    </w:p>
-    <w:p>
-      <w:pPr>
-        <w:rPr>
-          <w:sz w:val="24"/>
-        </w:rPr>
-      </w:pPr>
-      <w:r>
-        <w:rPr>
-          <w:sz w:val="24"/>
-        </w:rPr>
-        <w:t>Même val</w:t>
-      </w:r>
-      <w:r>
-        <w:rPr>
-          <w:sz w:val="24"/>
-        </w:rPr>
-        <w:t>idations que pour la création :</w:t>
-      </w:r>
-    </w:p>
-    <w:p>
-      <w:pPr>
-        <w:pStyle w:val="Paragraphedeliste"/>
-        <w:numPr>
-          <w:ilvl w:val="0"/>
-          <w:numId w:val="30"/>
-        </w:numPr>
-        <w:rPr>
-          <w:sz w:val="24"/>
-        </w:rPr>
-      </w:pPr>
-      <w:r>
-        <w:rPr>
-          <w:sz w:val="24"/>
-        </w:rPr>
-        <w:t>Courriel unique</w:t>
-      </w:r>
-    </w:p>
-    <w:p>
-      <w:pPr>
-        <w:pStyle w:val="Paragraphedeliste"/>
-        <w:numPr>
-          <w:ilvl w:val="0"/>
-          <w:numId w:val="30"/>
-        </w:numPr>
-        <w:rPr>
-          <w:sz w:val="24"/>
-        </w:rPr>
-      </w:pPr>
-      <w:r>
-        <w:rPr>
-          <w:sz w:val="24"/>
-        </w:rPr>
-        <w:t>Mot de passe valide</w:t>
-      </w:r>
-    </w:p>
-    <w:p>
-      <w:pPr>
-        <w:rPr>
-          <w:sz w:val="24"/>
-        </w:rPr>
-      </w:pPr>
-      <w:r>
-        <w:rPr>
-          <w:rFonts w:ascii="Segoe UI Symbol" w:hAnsi="Segoe UI Symbol" w:cs="Segoe UI Symbol"/>
-          <w:sz w:val="24"/>
+        <w:pStyle w:val="Lgende"/>
+        <w:rPr>
+          <w:sz w:val="24"/>
+        </w:rPr>
+      </w:pPr>
+      <w:r>
+        <w:t xml:space="preserve">Figure </w:t>
+      </w:r>
+      <w:fldSimple w:instr=" SEQ Figure \* ARABIC ">
+        <w:r>
+          <w:rPr>
+            <w:noProof/>
+          </w:rPr>
+          <w:t>4</w:t>
+        </w:r>
+      </w:fldSimple>
+      <w:r>
+        <w:t xml:space="preserve">: </w:t>
+      </w:r>
+      <w:r>
+        <w:t>Erreur de connexion</w:t>
+      </w:r>
+    </w:p>
+    <w:p>
+      <w:pPr>
+        <w:keepNext/>
+      </w:pPr>
+      <w:r>
+        <w:rPr>
+          <w:noProof/>
+          <w:sz w:val="24"/>
+          <w:lang w:eastAsia="fr-FR"/>
         </w:rPr>
         <w:lastRenderedPageBreak/>
         <w:drawing>
-          <wp:inline distT="0" distB="0" distL="0" distR="0" wp14:anchorId="12D0537E" wp14:editId="1714BA35">
-            <wp:extent cx="5760720" cy="4274300"/>
-            <wp:effectExtent l="0" t="0" r="0" b="0"/>
-            <wp:docPr id="6" name="Image 6"/>
+          <wp:inline distT="0" distB="0" distL="0" distR="0" wp14:anchorId="3B6CCBE1" wp14:editId="57D63933">
+            <wp:extent cx="4839119" cy="4740051"/>
+            <wp:effectExtent l="0" t="0" r="0" b="3810"/>
+            <wp:docPr id="9" name="Image 9"/>
             <wp:cNvGraphicFramePr>
               <a:graphicFrameLocks xmlns:a="http://schemas.openxmlformats.org/drawingml/2006/main" noChangeAspect="1"/>
             </wp:cNvGraphicFramePr>
@@ -2212,7 +2160,7 @@
                   <pic:spPr>
                     <a:xfrm>
                       <a:off x="0" y="0"/>
-                      <a:ext cx="5760720" cy="4274300"/>
+                      <a:ext cx="4839119" cy="4740051"/>
                     </a:xfrm>
                     <a:prstGeom prst="rect">
                       <a:avLst/>
@@ -2227,19 +2175,245 @@
     </w:p>
     <w:p>
       <w:pPr>
-        <w:rPr>
-          <w:sz w:val="24"/>
-        </w:rPr>
-      </w:pPr>
-      <w:r>
-        <w:rPr>
-          <w:sz w:val="24"/>
-        </w:rPr>
+        <w:pStyle w:val="Lgende"/>
+        <w:rPr>
+          <w:sz w:val="24"/>
+        </w:rPr>
+      </w:pPr>
+      <w:r>
+        <w:t xml:space="preserve">Figure </w:t>
+      </w:r>
+      <w:fldSimple w:instr=" SEQ Figure \* ARABIC ">
+        <w:r>
+          <w:rPr>
+            <w:noProof/>
+          </w:rPr>
+          <w:t>5</w:t>
+        </w:r>
+      </w:fldSimple>
+      <w:r>
+        <w:t>: Connexion réussie</w:t>
+      </w:r>
+    </w:p>
+    <w:p>
+      <w:pPr>
+        <w:pStyle w:val="Paragraphedeliste"/>
+        <w:numPr>
+          <w:ilvl w:val="0"/>
+          <w:numId w:val="24"/>
+        </w:numPr>
+        <w:rPr>
+          <w:b/>
+          <w:sz w:val="24"/>
+        </w:rPr>
+      </w:pPr>
+      <w:r>
+        <w:rPr>
+          <w:b/>
+          <w:sz w:val="24"/>
+        </w:rPr>
+        <w:t>Fenêtre principale</w:t>
+      </w:r>
+    </w:p>
+    <w:p>
+      <w:pPr>
+        <w:rPr>
+          <w:sz w:val="24"/>
+        </w:rPr>
+      </w:pPr>
+      <w:r>
+        <w:rPr>
+          <w:sz w:val="24"/>
+        </w:rPr>
+        <w:t>Après connexion :</w:t>
+      </w:r>
+    </w:p>
+    <w:p>
+      <w:pPr>
+        <w:rPr>
+          <w:sz w:val="24"/>
+        </w:rPr>
+      </w:pPr>
+      <w:r>
+        <w:rPr>
+          <w:sz w:val="24"/>
+        </w:rPr>
+        <w:t>Affichage :</w:t>
+      </w:r>
+    </w:p>
+    <w:p>
+      <w:pPr>
+        <w:pStyle w:val="Paragraphedeliste"/>
+        <w:numPr>
+          <w:ilvl w:val="0"/>
+          <w:numId w:val="27"/>
+        </w:numPr>
+        <w:rPr>
+          <w:sz w:val="24"/>
+        </w:rPr>
+      </w:pPr>
+      <w:r>
+        <w:rPr>
+          <w:sz w:val="24"/>
+        </w:rPr>
+        <w:t>Liste des clients (nom, prénom, courriel)</w:t>
+      </w:r>
+    </w:p>
+    <w:p>
+      <w:pPr>
+        <w:pStyle w:val="Paragraphedeliste"/>
+        <w:numPr>
+          <w:ilvl w:val="0"/>
+          <w:numId w:val="27"/>
+        </w:numPr>
+        <w:rPr>
+          <w:sz w:val="24"/>
+        </w:rPr>
+      </w:pPr>
+      <w:r>
+        <w:rPr>
+          <w:sz w:val="24"/>
+        </w:rPr>
+        <w:t>Liste des films (nom, durée, catégories)</w:t>
+      </w:r>
+    </w:p>
+    <w:p>
+      <w:pPr>
+        <w:pStyle w:val="Paragraphedeliste"/>
+        <w:numPr>
+          <w:ilvl w:val="0"/>
+          <w:numId w:val="27"/>
+        </w:numPr>
+        <w:rPr>
+          <w:sz w:val="24"/>
+        </w:rPr>
+      </w:pPr>
+      <w:r>
+        <w:rPr>
+          <w:sz w:val="24"/>
+        </w:rPr>
+        <w:t>Affichage des acteurs associés</w:t>
+      </w:r>
+    </w:p>
+    <w:p>
+      <w:pPr>
+        <w:rPr>
+          <w:sz w:val="24"/>
+        </w:rPr>
+      </w:pPr>
+      <w:r>
+        <w:rPr>
+          <w:sz w:val="24"/>
+        </w:rPr>
+        <w:t>Fonctionnalités :</w:t>
+      </w:r>
+    </w:p>
+    <w:p>
+      <w:pPr>
+        <w:pStyle w:val="Paragraphedeliste"/>
+        <w:numPr>
+          <w:ilvl w:val="0"/>
+          <w:numId w:val="28"/>
+        </w:numPr>
+        <w:rPr>
+          <w:sz w:val="24"/>
+        </w:rPr>
+      </w:pPr>
+      <w:r>
+        <w:rPr>
+          <w:sz w:val="24"/>
+        </w:rPr>
+        <w:t>Création client</w:t>
+      </w:r>
+    </w:p>
+    <w:p>
+      <w:pPr>
+        <w:pStyle w:val="Paragraphedeliste"/>
+        <w:numPr>
+          <w:ilvl w:val="0"/>
+          <w:numId w:val="28"/>
+        </w:numPr>
+        <w:rPr>
+          <w:sz w:val="24"/>
+        </w:rPr>
+      </w:pPr>
+      <w:r>
+        <w:rPr>
+          <w:sz w:val="24"/>
+        </w:rPr>
+        <w:t>Modification client</w:t>
+      </w:r>
+    </w:p>
+    <w:p>
+      <w:pPr>
+        <w:pStyle w:val="Paragraphedeliste"/>
+        <w:numPr>
+          <w:ilvl w:val="0"/>
+          <w:numId w:val="28"/>
+        </w:numPr>
+        <w:rPr>
+          <w:sz w:val="24"/>
+        </w:rPr>
+      </w:pPr>
+      <w:r>
+        <w:rPr>
+          <w:sz w:val="24"/>
+        </w:rPr>
+        <w:t>Suppression client</w:t>
+      </w:r>
+    </w:p>
+    <w:p>
+      <w:pPr>
+        <w:pStyle w:val="Paragraphedeliste"/>
+        <w:numPr>
+          <w:ilvl w:val="0"/>
+          <w:numId w:val="28"/>
+        </w:numPr>
+        <w:rPr>
+          <w:sz w:val="24"/>
+        </w:rPr>
+      </w:pPr>
+      <w:r>
+        <w:rPr>
+          <w:sz w:val="24"/>
+        </w:rPr>
+        <w:t>Déconnexion</w:t>
+      </w:r>
+    </w:p>
+    <w:p>
+      <w:pPr>
+        <w:pStyle w:val="Paragraphedeliste"/>
+        <w:numPr>
+          <w:ilvl w:val="0"/>
+          <w:numId w:val="28"/>
+        </w:numPr>
+        <w:rPr>
+          <w:sz w:val="24"/>
+        </w:rPr>
+      </w:pPr>
+      <w:r>
+        <w:rPr>
+          <w:sz w:val="24"/>
+        </w:rPr>
+        <w:t>Quitter</w:t>
+      </w:r>
+    </w:p>
+    <w:p>
+      <w:pPr>
+        <w:keepNext/>
+      </w:pPr>
+      <w:r>
+        <w:rPr>
+          <w:noProof/>
+          <w:sz w:val="24"/>
+          <w:lang w:eastAsia="fr-FR"/>
+        </w:rPr>
+        <w:lastRenderedPageBreak/>
         <w:drawing>
-          <wp:inline distT="0" distB="0" distL="0" distR="0" wp14:anchorId="271D114F" wp14:editId="203F72E8">
-            <wp:extent cx="5760720" cy="4337382"/>
-            <wp:effectExtent l="0" t="0" r="0" b="6350"/>
-            <wp:docPr id="10" name="Image 10"/>
+          <wp:inline distT="0" distB="0" distL="0" distR="0" wp14:anchorId="76A97A92" wp14:editId="5ED0192A">
+            <wp:extent cx="5760720" cy="4321459"/>
+            <wp:effectExtent l="0" t="0" r="0" b="3175"/>
+            <wp:docPr id="2" name="Image 2"/>
             <wp:cNvGraphicFramePr>
               <a:graphicFrameLocks xmlns:a="http://schemas.openxmlformats.org/drawingml/2006/main" noChangeAspect="1"/>
             </wp:cNvGraphicFramePr>
@@ -2259,6 +2433,474 @@
                   <pic:spPr>
                     <a:xfrm>
                       <a:off x="0" y="0"/>
+                      <a:ext cx="5760720" cy="4321459"/>
+                    </a:xfrm>
+                    <a:prstGeom prst="rect">
+                      <a:avLst/>
+                    </a:prstGeom>
+                  </pic:spPr>
+                </pic:pic>
+              </a:graphicData>
+            </a:graphic>
+          </wp:inline>
+        </w:drawing>
+      </w:r>
+    </w:p>
+    <w:p>
+      <w:pPr>
+        <w:pStyle w:val="Lgende"/>
+        <w:rPr>
+          <w:sz w:val="24"/>
+        </w:rPr>
+      </w:pPr>
+      <w:r>
+        <w:t xml:space="preserve">Figure </w:t>
+      </w:r>
+      <w:fldSimple w:instr=" SEQ Figure \* ARABIC ">
+        <w:r>
+          <w:rPr>
+            <w:noProof/>
+          </w:rPr>
+          <w:t>6</w:t>
+        </w:r>
+      </w:fldSimple>
+      <w:r>
+        <w:t xml:space="preserve">: </w:t>
+      </w:r>
+      <w:r>
+        <w:t>Fenêtre principale (accès total)</w:t>
+      </w:r>
+    </w:p>
+    <w:p>
+      <w:pPr>
+        <w:pStyle w:val="Paragraphedeliste"/>
+        <w:numPr>
+          <w:ilvl w:val="0"/>
+          <w:numId w:val="24"/>
+        </w:numPr>
+        <w:rPr>
+          <w:b/>
+          <w:sz w:val="24"/>
+        </w:rPr>
+      </w:pPr>
+      <w:r>
+        <w:rPr>
+          <w:b/>
+          <w:sz w:val="24"/>
+        </w:rPr>
+        <w:t>Création d’un client</w:t>
+      </w:r>
+    </w:p>
+    <w:p>
+      <w:pPr>
+        <w:rPr>
+          <w:sz w:val="24"/>
+        </w:rPr>
+      </w:pPr>
+      <w:r>
+        <w:rPr>
+          <w:sz w:val="24"/>
+        </w:rPr>
+        <w:t>Validation effectuée :</w:t>
+      </w:r>
+    </w:p>
+    <w:p>
+      <w:pPr>
+        <w:pStyle w:val="Paragraphedeliste"/>
+        <w:numPr>
+          <w:ilvl w:val="0"/>
+          <w:numId w:val="29"/>
+        </w:numPr>
+        <w:rPr>
+          <w:sz w:val="24"/>
+        </w:rPr>
+      </w:pPr>
+      <w:r>
+        <w:rPr>
+          <w:sz w:val="24"/>
+        </w:rPr>
+        <w:t>Courriel unique</w:t>
+      </w:r>
+    </w:p>
+    <w:p>
+      <w:pPr>
+        <w:pStyle w:val="Paragraphedeliste"/>
+        <w:numPr>
+          <w:ilvl w:val="0"/>
+          <w:numId w:val="29"/>
+        </w:numPr>
+        <w:rPr>
+          <w:sz w:val="24"/>
+        </w:rPr>
+      </w:pPr>
+      <w:r>
+        <w:rPr>
+          <w:sz w:val="24"/>
+        </w:rPr>
+        <w:t>Mot de passe minimum 8 caractères</w:t>
+      </w:r>
+    </w:p>
+    <w:p>
+      <w:pPr>
+        <w:pStyle w:val="Paragraphedeliste"/>
+        <w:numPr>
+          <w:ilvl w:val="0"/>
+          <w:numId w:val="29"/>
+        </w:numPr>
+        <w:rPr>
+          <w:sz w:val="24"/>
+        </w:rPr>
+      </w:pPr>
+      <w:r>
+        <w:rPr>
+          <w:sz w:val="24"/>
+        </w:rPr>
+        <w:t xml:space="preserve">Gestion des erreurs avec </w:t>
+      </w:r>
+      <w:proofErr w:type="spellStart"/>
+      <w:r>
+        <w:rPr>
+          <w:sz w:val="24"/>
+        </w:rPr>
+        <w:t>try</w:t>
+      </w:r>
+      <w:proofErr w:type="spellEnd"/>
+      <w:r>
+        <w:rPr>
+          <w:sz w:val="24"/>
+        </w:rPr>
+        <w:t>/</w:t>
+      </w:r>
+      <w:proofErr w:type="spellStart"/>
+      <w:r>
+        <w:rPr>
+          <w:sz w:val="24"/>
+        </w:rPr>
+        <w:t>except</w:t>
+      </w:r>
+      <w:proofErr w:type="spellEnd"/>
+    </w:p>
+    <w:p>
+      <w:pPr>
+        <w:rPr>
+          <w:sz w:val="24"/>
+        </w:rPr>
+      </w:pPr>
+    </w:p>
+    <w:p>
+      <w:pPr>
+        <w:keepNext/>
+      </w:pPr>
+      <w:r>
+        <w:rPr>
+          <w:noProof/>
+          <w:sz w:val="24"/>
+          <w:lang w:eastAsia="fr-FR"/>
+        </w:rPr>
+        <w:lastRenderedPageBreak/>
+        <w:drawing>
+          <wp:inline distT="0" distB="0" distL="0" distR="0" wp14:anchorId="095D2689" wp14:editId="559C1874">
+            <wp:extent cx="5760720" cy="4170796"/>
+            <wp:effectExtent l="0" t="0" r="0" b="1270"/>
+            <wp:docPr id="3" name="Image 3"/>
+            <wp:cNvGraphicFramePr>
+              <a:graphicFrameLocks xmlns:a="http://schemas.openxmlformats.org/drawingml/2006/main" noChangeAspect="1"/>
+            </wp:cNvGraphicFramePr>
+            <a:graphic xmlns:a="http://schemas.openxmlformats.org/drawingml/2006/main">
+              <a:graphicData uri="http://schemas.openxmlformats.org/drawingml/2006/picture">
+                <pic:pic xmlns:pic="http://schemas.openxmlformats.org/drawingml/2006/picture">
+                  <pic:nvPicPr>
+                    <pic:cNvPr id="0" name=""/>
+                    <pic:cNvPicPr/>
+                  </pic:nvPicPr>
+                  <pic:blipFill>
+                    <a:blip r:embed="rId18"/>
+                    <a:stretch>
+                      <a:fillRect/>
+                    </a:stretch>
+                  </pic:blipFill>
+                  <pic:spPr>
+                    <a:xfrm>
+                      <a:off x="0" y="0"/>
+                      <a:ext cx="5760720" cy="4170796"/>
+                    </a:xfrm>
+                    <a:prstGeom prst="rect">
+                      <a:avLst/>
+                    </a:prstGeom>
+                  </pic:spPr>
+                </pic:pic>
+              </a:graphicData>
+            </a:graphic>
+          </wp:inline>
+        </w:drawing>
+      </w:r>
+    </w:p>
+    <w:p>
+      <w:pPr>
+        <w:pStyle w:val="Lgende"/>
+        <w:rPr>
+          <w:sz w:val="24"/>
+        </w:rPr>
+      </w:pPr>
+      <w:r>
+        <w:t xml:space="preserve">Figure </w:t>
+      </w:r>
+      <w:fldSimple w:instr=" SEQ Figure \* ARABIC ">
+        <w:r>
+          <w:rPr>
+            <w:noProof/>
+          </w:rPr>
+          <w:t>7</w:t>
+        </w:r>
+      </w:fldSimple>
+      <w:r>
+        <w:t xml:space="preserve">: </w:t>
+      </w:r>
+      <w:r>
+        <w:t>Formulaire création client</w:t>
+      </w:r>
+    </w:p>
+    <w:p>
+      <w:pPr>
+        <w:pStyle w:val="Paragraphedeliste"/>
+        <w:numPr>
+          <w:ilvl w:val="0"/>
+          <w:numId w:val="24"/>
+        </w:numPr>
+        <w:rPr>
+          <w:b/>
+          <w:sz w:val="24"/>
+        </w:rPr>
+      </w:pPr>
+      <w:r>
+        <w:rPr>
+          <w:b/>
+          <w:sz w:val="24"/>
+        </w:rPr>
+        <w:t>Modification d’un client</w:t>
+      </w:r>
+    </w:p>
+    <w:p>
+      <w:pPr>
+        <w:rPr>
+          <w:sz w:val="24"/>
+        </w:rPr>
+      </w:pPr>
+      <w:r>
+        <w:rPr>
+          <w:sz w:val="24"/>
+        </w:rPr>
+        <w:t>Même val</w:t>
+      </w:r>
+      <w:r>
+        <w:rPr>
+          <w:sz w:val="24"/>
+        </w:rPr>
+        <w:t>idations que pour la création :</w:t>
+      </w:r>
+    </w:p>
+    <w:p>
+      <w:pPr>
+        <w:pStyle w:val="Paragraphedeliste"/>
+        <w:numPr>
+          <w:ilvl w:val="0"/>
+          <w:numId w:val="30"/>
+        </w:numPr>
+        <w:rPr>
+          <w:sz w:val="24"/>
+        </w:rPr>
+      </w:pPr>
+      <w:r>
+        <w:rPr>
+          <w:sz w:val="24"/>
+        </w:rPr>
+        <w:t>Courriel unique</w:t>
+      </w:r>
+    </w:p>
+    <w:p>
+      <w:pPr>
+        <w:pStyle w:val="Paragraphedeliste"/>
+        <w:numPr>
+          <w:ilvl w:val="0"/>
+          <w:numId w:val="30"/>
+        </w:numPr>
+        <w:rPr>
+          <w:sz w:val="24"/>
+        </w:rPr>
+      </w:pPr>
+      <w:r>
+        <w:rPr>
+          <w:sz w:val="24"/>
+        </w:rPr>
+        <w:t>Mot de passe valide</w:t>
+      </w:r>
+    </w:p>
+    <w:p>
+      <w:pPr>
+        <w:keepNext/>
+      </w:pPr>
+      <w:r>
+        <w:rPr>
+          <w:noProof/>
+          <w:sz w:val="24"/>
+          <w:lang w:eastAsia="fr-FR"/>
+        </w:rPr>
+        <w:drawing>
+          <wp:inline distT="0" distB="0" distL="0" distR="0" wp14:anchorId="5B9BDDDE" wp14:editId="059B6D56">
+            <wp:extent cx="5760720" cy="3078480"/>
+            <wp:effectExtent l="0" t="0" r="0" b="7620"/>
+            <wp:docPr id="12" name="Image 12"/>
+            <wp:cNvGraphicFramePr>
+              <a:graphicFrameLocks xmlns:a="http://schemas.openxmlformats.org/drawingml/2006/main" noChangeAspect="1"/>
+            </wp:cNvGraphicFramePr>
+            <a:graphic xmlns:a="http://schemas.openxmlformats.org/drawingml/2006/main">
+              <a:graphicData uri="http://schemas.openxmlformats.org/drawingml/2006/picture">
+                <pic:pic xmlns:pic="http://schemas.openxmlformats.org/drawingml/2006/picture">
+                  <pic:nvPicPr>
+                    <pic:cNvPr id="0" name=""/>
+                    <pic:cNvPicPr/>
+                  </pic:nvPicPr>
+                  <pic:blipFill rotWithShape="1">
+                    <a:blip r:embed="rId19"/>
+                    <a:srcRect t="10631" b="16574"/>
+                    <a:stretch/>
+                  </pic:blipFill>
+                  <pic:spPr bwMode="auto">
+                    <a:xfrm>
+                      <a:off x="0" y="0"/>
+                      <a:ext cx="5760720" cy="3078480"/>
+                    </a:xfrm>
+                    <a:prstGeom prst="rect">
+                      <a:avLst/>
+                    </a:prstGeom>
+                    <a:ln>
+                      <a:noFill/>
+                    </a:ln>
+                    <a:extLst>
+                      <a:ext uri="{53640926-AAD7-44D8-BBD7-CCE9431645EC}">
+                        <a14:shadowObscured xmlns:a14="http://schemas.microsoft.com/office/drawing/2010/main"/>
+                      </a:ext>
+                    </a:extLst>
+                  </pic:spPr>
+                </pic:pic>
+              </a:graphicData>
+            </a:graphic>
+          </wp:inline>
+        </w:drawing>
+      </w:r>
+    </w:p>
+    <w:p>
+      <w:pPr>
+        <w:pStyle w:val="Lgende"/>
+        <w:rPr>
+          <w:sz w:val="24"/>
+        </w:rPr>
+      </w:pPr>
+      <w:r>
+        <w:t xml:space="preserve">Figure </w:t>
+      </w:r>
+      <w:fldSimple w:instr=" SEQ Figure \* ARABIC ">
+        <w:r>
+          <w:rPr>
+            <w:noProof/>
+          </w:rPr>
+          <w:t>8</w:t>
+        </w:r>
+      </w:fldSimple>
+      <w:r>
+        <w:t xml:space="preserve">: </w:t>
+      </w:r>
+      <w:r>
+        <w:t>Message d'erreur courriel dupliqué</w:t>
+      </w:r>
+    </w:p>
+    <w:p>
+      <w:pPr>
+        <w:rPr>
+          <w:sz w:val="24"/>
+        </w:rPr>
+      </w:pPr>
+      <w:r>
+        <w:rPr>
+          <w:rFonts w:ascii="Segoe UI Symbol" w:hAnsi="Segoe UI Symbol" w:cs="Segoe UI Symbol"/>
+          <w:noProof/>
+          <w:sz w:val="24"/>
+          <w:lang w:eastAsia="fr-FR"/>
+        </w:rPr>
+        <w:lastRenderedPageBreak/>
+        <w:drawing>
+          <wp:inline distT="0" distB="0" distL="0" distR="0" wp14:anchorId="12D0537E" wp14:editId="1714BA35">
+            <wp:extent cx="5760720" cy="4274300"/>
+            <wp:effectExtent l="0" t="0" r="0" b="0"/>
+            <wp:docPr id="6" name="Image 6"/>
+            <wp:cNvGraphicFramePr>
+              <a:graphicFrameLocks xmlns:a="http://schemas.openxmlformats.org/drawingml/2006/main" noChangeAspect="1"/>
+            </wp:cNvGraphicFramePr>
+            <a:graphic xmlns:a="http://schemas.openxmlformats.org/drawingml/2006/main">
+              <a:graphicData uri="http://schemas.openxmlformats.org/drawingml/2006/picture">
+                <pic:pic xmlns:pic="http://schemas.openxmlformats.org/drawingml/2006/picture">
+                  <pic:nvPicPr>
+                    <pic:cNvPr id="0" name=""/>
+                    <pic:cNvPicPr/>
+                  </pic:nvPicPr>
+                  <pic:blipFill>
+                    <a:blip r:embed="rId20"/>
+                    <a:stretch>
+                      <a:fillRect/>
+                    </a:stretch>
+                  </pic:blipFill>
+                  <pic:spPr>
+                    <a:xfrm>
+                      <a:off x="0" y="0"/>
+                      <a:ext cx="5760720" cy="4274300"/>
+                    </a:xfrm>
+                    <a:prstGeom prst="rect">
+                      <a:avLst/>
+                    </a:prstGeom>
+                  </pic:spPr>
+                </pic:pic>
+              </a:graphicData>
+            </a:graphic>
+          </wp:inline>
+        </w:drawing>
+      </w:r>
+    </w:p>
+    <w:p>
+      <w:pPr>
+        <w:rPr>
+          <w:sz w:val="24"/>
+        </w:rPr>
+      </w:pPr>
+      <w:r>
+        <w:rPr>
+          <w:noProof/>
+          <w:sz w:val="24"/>
+          <w:lang w:eastAsia="fr-FR"/>
+        </w:rPr>
+        <w:drawing>
+          <wp:inline distT="0" distB="0" distL="0" distR="0" wp14:anchorId="271D114F" wp14:editId="203F72E8">
+            <wp:extent cx="5760720" cy="4337382"/>
+            <wp:effectExtent l="0" t="0" r="0" b="6350"/>
+            <wp:docPr id="10" name="Image 10"/>
+            <wp:cNvGraphicFramePr>
+              <a:graphicFrameLocks xmlns:a="http://schemas.openxmlformats.org/drawingml/2006/main" noChangeAspect="1"/>
+            </wp:cNvGraphicFramePr>
+            <a:graphic xmlns:a="http://schemas.openxmlformats.org/drawingml/2006/main">
+              <a:graphicData uri="http://schemas.openxmlformats.org/drawingml/2006/picture">
+                <pic:pic xmlns:pic="http://schemas.openxmlformats.org/drawingml/2006/picture">
+                  <pic:nvPicPr>
+                    <pic:cNvPr id="0" name=""/>
+                    <pic:cNvPicPr/>
+                  </pic:nvPicPr>
+                  <pic:blipFill>
+                    <a:blip r:embed="rId21"/>
+                    <a:stretch>
+                      <a:fillRect/>
+                    </a:stretch>
+                  </pic:blipFill>
+                  <pic:spPr>
+                    <a:xfrm>
+                      <a:off x="0" y="0"/>
                       <a:ext cx="5760720" cy="4337382"/>
                     </a:xfrm>
                     <a:prstGeom prst="rect">
@@ -2271,6 +2913,78 @@
           </wp:inline>
         </w:drawing>
       </w:r>
+    </w:p>
+    <w:p>
+      <w:pPr>
+        <w:keepNext/>
+      </w:pPr>
+      <w:r>
+        <w:rPr>
+          <w:noProof/>
+          <w:sz w:val="24"/>
+          <w:lang w:eastAsia="fr-FR"/>
+        </w:rPr>
+        <w:lastRenderedPageBreak/>
+        <w:drawing>
+          <wp:inline distT="0" distB="0" distL="0" distR="0" wp14:anchorId="61DC70E2" wp14:editId="60E3713B">
+            <wp:extent cx="5760720" cy="4196519"/>
+            <wp:effectExtent l="0" t="0" r="0" b="0"/>
+            <wp:docPr id="13" name="Image 13"/>
+            <wp:cNvGraphicFramePr>
+              <a:graphicFrameLocks xmlns:a="http://schemas.openxmlformats.org/drawingml/2006/main" noChangeAspect="1"/>
+            </wp:cNvGraphicFramePr>
+            <a:graphic xmlns:a="http://schemas.openxmlformats.org/drawingml/2006/main">
+              <a:graphicData uri="http://schemas.openxmlformats.org/drawingml/2006/picture">
+                <pic:pic xmlns:pic="http://schemas.openxmlformats.org/drawingml/2006/picture">
+                  <pic:nvPicPr>
+                    <pic:cNvPr id="0" name=""/>
+                    <pic:cNvPicPr/>
+                  </pic:nvPicPr>
+                  <pic:blipFill>
+                    <a:blip r:embed="rId22"/>
+                    <a:stretch>
+                      <a:fillRect/>
+                    </a:stretch>
+                  </pic:blipFill>
+                  <pic:spPr>
+                    <a:xfrm>
+                      <a:off x="0" y="0"/>
+                      <a:ext cx="5760720" cy="4196519"/>
+                    </a:xfrm>
+                    <a:prstGeom prst="rect">
+                      <a:avLst/>
+                    </a:prstGeom>
+                  </pic:spPr>
+                </pic:pic>
+              </a:graphicData>
+            </a:graphic>
+          </wp:inline>
+        </w:drawing>
+      </w:r>
+    </w:p>
+    <w:p>
+      <w:pPr>
+        <w:pStyle w:val="Lgende"/>
+      </w:pPr>
+      <w:r>
+        <w:t xml:space="preserve">Figure </w:t>
+      </w:r>
+      <w:fldSimple w:instr=" SEQ Figure \* ARABIC ">
+        <w:r>
+          <w:rPr>
+            <w:noProof/>
+          </w:rPr>
+          <w:t>9</w:t>
+        </w:r>
+      </w:fldSimple>
+      <w:r>
+        <w:t xml:space="preserve">: </w:t>
+      </w:r>
+      <w:r>
+        <w:t>Mode lecture seule</w:t>
+      </w:r>
+    </w:p>
+    <w:p>
       <w:bookmarkStart w:id="0" w:name="_GoBack"/>
       <w:bookmarkEnd w:id="0"/>
     </w:p>
@@ -2307,7 +3021,6 @@
         <w:rPr>
           <w:sz w:val="24"/>
         </w:rPr>
-        <w:lastRenderedPageBreak/>
         <w:t>Les éléments</w:t>
       </w:r>
       <w:r>
@@ -2448,168 +3161,168 @@
           <w:sz w:val="24"/>
         </w:rPr>
       </w:pPr>
-      <w:r>
-        <w:rPr>
-          <w:sz w:val="24"/>
-        </w:rPr>
-        <w:t>Exemple de gestion d’erreur :</w:t>
-      </w:r>
-    </w:p>
-    <w:p>
-      <w:pPr>
-        <w:rPr>
-          <w:sz w:val="24"/>
-          <w:highlight w:val="yellow"/>
-        </w:rPr>
-      </w:pPr>
-      <w:proofErr w:type="spellStart"/>
-      <w:proofErr w:type="gramStart"/>
-      <w:r>
-        <w:rPr>
-          <w:sz w:val="24"/>
-          <w:highlight w:val="yellow"/>
-        </w:rPr>
-        <w:t>try</w:t>
-      </w:r>
-      <w:proofErr w:type="spellEnd"/>
-      <w:proofErr w:type="gramEnd"/>
-      <w:r>
-        <w:rPr>
-          <w:sz w:val="24"/>
-          <w:highlight w:val="yellow"/>
-        </w:rPr>
-        <w:t>:</w:t>
-      </w:r>
-    </w:p>
-    <w:p>
-      <w:pPr>
-        <w:rPr>
-          <w:sz w:val="24"/>
-          <w:highlight w:val="yellow"/>
-        </w:rPr>
-      </w:pPr>
-      <w:r>
-        <w:rPr>
-          <w:sz w:val="24"/>
-          <w:highlight w:val="yellow"/>
-        </w:rPr>
-        <w:t xml:space="preserve">    valeur = </w:t>
-      </w:r>
-      <w:proofErr w:type="spellStart"/>
-      <w:proofErr w:type="gramStart"/>
-      <w:r>
-        <w:rPr>
-          <w:sz w:val="24"/>
-          <w:highlight w:val="yellow"/>
-        </w:rPr>
-        <w:t>int</w:t>
-      </w:r>
-      <w:proofErr w:type="spellEnd"/>
-      <w:r>
-        <w:rPr>
-          <w:sz w:val="24"/>
-          <w:highlight w:val="yellow"/>
-        </w:rPr>
-        <w:t>(</w:t>
-      </w:r>
-      <w:proofErr w:type="spellStart"/>
-      <w:proofErr w:type="gramEnd"/>
-      <w:r>
-        <w:rPr>
-          <w:sz w:val="24"/>
-          <w:highlight w:val="yellow"/>
-        </w:rPr>
-        <w:t>entree</w:t>
-      </w:r>
-      <w:proofErr w:type="spellEnd"/>
-      <w:r>
-        <w:rPr>
-          <w:sz w:val="24"/>
-          <w:highlight w:val="yellow"/>
-        </w:rPr>
-        <w:t>)</w:t>
-      </w:r>
-    </w:p>
-    <w:p>
-      <w:pPr>
-        <w:rPr>
-          <w:sz w:val="24"/>
-          <w:highlight w:val="yellow"/>
-        </w:rPr>
-      </w:pPr>
-      <w:proofErr w:type="spellStart"/>
-      <w:proofErr w:type="gramStart"/>
-      <w:r>
-        <w:rPr>
-          <w:sz w:val="24"/>
-          <w:highlight w:val="yellow"/>
-        </w:rPr>
-        <w:t>except</w:t>
-      </w:r>
-      <w:proofErr w:type="spellEnd"/>
-      <w:proofErr w:type="gramEnd"/>
-      <w:r>
-        <w:rPr>
-          <w:sz w:val="24"/>
-          <w:highlight w:val="yellow"/>
-        </w:rPr>
+    </w:p>
+    <w:p>
+      <w:pPr>
+        <w:rPr>
+          <w:sz w:val="24"/>
+        </w:rPr>
+      </w:pPr>
+    </w:p>
+    <w:p>
+      <w:pPr>
+        <w:rPr>
+          <w:sz w:val="24"/>
+        </w:rPr>
+      </w:pPr>
+    </w:p>
+    <w:p>
+      <w:pPr>
+        <w:rPr>
+          <w:sz w:val="24"/>
+        </w:rPr>
+      </w:pPr>
+    </w:p>
+    <w:p>
+      <w:pPr>
+        <w:rPr>
+          <w:sz w:val="24"/>
+        </w:rPr>
+      </w:pPr>
+    </w:p>
+    <w:p>
+      <w:pPr>
+        <w:rPr>
+          <w:sz w:val="24"/>
+        </w:rPr>
+      </w:pPr>
+    </w:p>
+    <w:p>
+      <w:pPr>
+        <w:rPr>
+          <w:sz w:val="24"/>
+        </w:rPr>
+      </w:pPr>
+      <w:r>
+        <w:rPr>
+          <w:sz w:val="24"/>
+        </w:rPr>
+        <w:lastRenderedPageBreak/>
+        <w:t>Hashage des mots de passe (SHA-256) :</w:t>
+      </w:r>
+    </w:p>
+    <w:p>
+      <w:pPr>
+        <w:rPr>
+          <w:sz w:val="24"/>
+        </w:rPr>
+      </w:pPr>
+      <w:r>
+        <w:t># utils.py</w:t>
+      </w:r>
+    </w:p>
+    <w:p>
+      <w:pPr>
+        <w:rPr>
+          <w:sz w:val="24"/>
+        </w:rPr>
+      </w:pPr>
+      <w:r>
+        <w:drawing>
+          <wp:inline distT="0" distB="0" distL="0" distR="0" wp14:anchorId="470AF72E" wp14:editId="5C2766FE">
+            <wp:extent cx="5760720" cy="2987539"/>
+            <wp:effectExtent l="0" t="0" r="0" b="3810"/>
+            <wp:docPr id="23" name="Image 23"/>
+            <wp:cNvGraphicFramePr>
+              <a:graphicFrameLocks xmlns:a="http://schemas.openxmlformats.org/drawingml/2006/main" noChangeAspect="1"/>
+            </wp:cNvGraphicFramePr>
+            <a:graphic xmlns:a="http://schemas.openxmlformats.org/drawingml/2006/main">
+              <a:graphicData uri="http://schemas.openxmlformats.org/drawingml/2006/picture">
+                <pic:pic xmlns:pic="http://schemas.openxmlformats.org/drawingml/2006/picture">
+                  <pic:nvPicPr>
+                    <pic:cNvPr id="0" name=""/>
+                    <pic:cNvPicPr/>
+                  </pic:nvPicPr>
+                  <pic:blipFill>
+                    <a:blip r:embed="rId23"/>
+                    <a:stretch>
+                      <a:fillRect/>
+                    </a:stretch>
+                  </pic:blipFill>
+                  <pic:spPr>
+                    <a:xfrm>
+                      <a:off x="0" y="0"/>
+                      <a:ext cx="5760720" cy="2987539"/>
+                    </a:xfrm>
+                    <a:prstGeom prst="rect">
+                      <a:avLst/>
+                    </a:prstGeom>
+                  </pic:spPr>
+                </pic:pic>
+              </a:graphicData>
+            </a:graphic>
+          </wp:inline>
+        </w:drawing>
+      </w:r>
+      <w:r>
         <w:t xml:space="preserve"> </w:t>
       </w:r>
-      <w:proofErr w:type="spellStart"/>
-      <w:r>
-        <w:rPr>
-          <w:sz w:val="24"/>
-          <w:highlight w:val="yellow"/>
-        </w:rPr>
-        <w:t>ValueError</w:t>
-      </w:r>
-      <w:proofErr w:type="spellEnd"/>
-      <w:r>
-        <w:rPr>
-          <w:sz w:val="24"/>
-          <w:highlight w:val="yellow"/>
-        </w:rPr>
-        <w:t>:</w:t>
-      </w:r>
-    </w:p>
-    <w:p>
-      <w:pPr>
-        <w:rPr>
-          <w:sz w:val="24"/>
-        </w:rPr>
-      </w:pPr>
-      <w:r>
-        <w:rPr>
-          <w:sz w:val="24"/>
-          <w:highlight w:val="yellow"/>
-        </w:rPr>
-        <w:t xml:space="preserve">    </w:t>
-      </w:r>
-      <w:proofErr w:type="spellStart"/>
-      <w:proofErr w:type="gramStart"/>
-      <w:r>
-        <w:rPr>
-          <w:sz w:val="24"/>
-          <w:highlight w:val="yellow"/>
-        </w:rPr>
-        <w:t>print</w:t>
-      </w:r>
-      <w:proofErr w:type="spellEnd"/>
-      <w:r>
-        <w:rPr>
-          <w:sz w:val="24"/>
-          <w:highlight w:val="yellow"/>
-        </w:rPr>
-        <w:t>(</w:t>
-      </w:r>
-      <w:proofErr w:type="gramEnd"/>
-      <w:r>
-        <w:rPr>
-          <w:sz w:val="24"/>
-          <w:highlight w:val="yellow"/>
-        </w:rPr>
-        <w:t>"Entrée invalide")</w:t>
-      </w:r>
+    </w:p>
+    <w:p>
+      <w:pPr>
+        <w:rPr>
+          <w:sz w:val="24"/>
+        </w:rPr>
+      </w:pPr>
+      <w:r>
+        <w:t># models/employe.py</w:t>
+      </w:r>
+    </w:p>
+    <w:p>
+      <w:r>
+        <w:drawing>
+          <wp:inline distT="0" distB="0" distL="0" distR="0" wp14:anchorId="62D770AF" wp14:editId="6AA8B15D">
+            <wp:extent cx="5760720" cy="3683897"/>
+            <wp:effectExtent l="0" t="0" r="0" b="0"/>
+            <wp:docPr id="22" name="Image 22"/>
+            <wp:cNvGraphicFramePr>
+              <a:graphicFrameLocks xmlns:a="http://schemas.openxmlformats.org/drawingml/2006/main" noChangeAspect="1"/>
+            </wp:cNvGraphicFramePr>
+            <a:graphic xmlns:a="http://schemas.openxmlformats.org/drawingml/2006/main">
+              <a:graphicData uri="http://schemas.openxmlformats.org/drawingml/2006/picture">
+                <pic:pic xmlns:pic="http://schemas.openxmlformats.org/drawingml/2006/picture">
+                  <pic:nvPicPr>
+                    <pic:cNvPr id="0" name=""/>
+                    <pic:cNvPicPr/>
+                  </pic:nvPicPr>
+                  <pic:blipFill>
+                    <a:blip r:embed="rId24"/>
+                    <a:stretch>
+                      <a:fillRect/>
+                    </a:stretch>
+                  </pic:blipFill>
+                  <pic:spPr>
+                    <a:xfrm>
+                      <a:off x="0" y="0"/>
+                      <a:ext cx="5760720" cy="3683897"/>
+                    </a:xfrm>
+                    <a:prstGeom prst="rect">
+                      <a:avLst/>
+                    </a:prstGeom>
+                  </pic:spPr>
+                </pic:pic>
+              </a:graphicData>
+            </a:graphic>
+          </wp:inline>
+        </w:drawing>
+      </w:r>
+    </w:p>
+    <w:p>
+      <w:pPr>
+        <w:rPr>
+          <w:sz w:val="24"/>
+        </w:rPr>
+      </w:pPr>
     </w:p>
     <w:p>
       <w:pPr>
@@ -2703,6 +3416,7 @@
         <w:rPr>
           <w:sz w:val="24"/>
         </w:rPr>
+        <w:lastRenderedPageBreak/>
         <w:t>Encapsulation des attributs</w:t>
       </w:r>
       <w:r>
@@ -2750,11 +3464,182 @@
     </w:p>
     <w:p>
       <w:pPr>
-        <w:pStyle w:val="Paragraphedeliste"/>
-        <w:rPr>
-          <w:sz w:val="24"/>
-        </w:rPr>
-      </w:pPr>
+        <w:jc w:val="center"/>
+        <w:rPr>
+          <w:sz w:val="24"/>
+        </w:rPr>
+      </w:pPr>
+      <w:r>
+        <w:rPr>
+          <w:sz w:val="24"/>
+        </w:rPr>
+        <w:t>Exemple concret d’héritage dans le projet :</w:t>
+      </w:r>
+    </w:p>
+    <w:p>
+      <w:r>
+        <w:t># models/personne.py</w:t>
+      </w:r>
+    </w:p>
+    <w:p>
+      <w:pPr>
+        <w:ind w:firstLine="708"/>
+      </w:pPr>
+    </w:p>
+    <w:p>
+      <w:pPr>
+        <w:pStyle w:val="NormalWeb"/>
+        <w:keepNext/>
+      </w:pPr>
+      <w:r>
+        <w:lastRenderedPageBreak/>
+        <w:drawing>
+          <wp:inline distT="0" distB="0" distL="0" distR="0" wp14:anchorId="14A1F759" wp14:editId="2D9B893A">
+            <wp:extent cx="5760720" cy="3058583"/>
+            <wp:effectExtent l="0" t="0" r="0" b="8890"/>
+            <wp:docPr id="19" name="Image 19"/>
+            <wp:cNvGraphicFramePr>
+              <a:graphicFrameLocks xmlns:a="http://schemas.openxmlformats.org/drawingml/2006/main" noChangeAspect="1"/>
+            </wp:cNvGraphicFramePr>
+            <a:graphic xmlns:a="http://schemas.openxmlformats.org/drawingml/2006/main">
+              <a:graphicData uri="http://schemas.openxmlformats.org/drawingml/2006/picture">
+                <pic:pic xmlns:pic="http://schemas.openxmlformats.org/drawingml/2006/picture">
+                  <pic:nvPicPr>
+                    <pic:cNvPr id="0" name=""/>
+                    <pic:cNvPicPr/>
+                  </pic:nvPicPr>
+                  <pic:blipFill>
+                    <a:blip r:embed="rId25"/>
+                    <a:stretch>
+                      <a:fillRect/>
+                    </a:stretch>
+                  </pic:blipFill>
+                  <pic:spPr>
+                    <a:xfrm>
+                      <a:off x="0" y="0"/>
+                      <a:ext cx="5760720" cy="3058583"/>
+                    </a:xfrm>
+                    <a:prstGeom prst="rect">
+                      <a:avLst/>
+                    </a:prstGeom>
+                  </pic:spPr>
+                </pic:pic>
+              </a:graphicData>
+            </a:graphic>
+          </wp:inline>
+        </w:drawing>
+      </w:r>
+      <w:r>
+        <w:t xml:space="preserve"> </w:t>
+      </w:r>
+    </w:p>
+    <w:p>
+      <w:pPr>
+        <w:pStyle w:val="NormalWeb"/>
+        <w:keepNext/>
+      </w:pPr>
+      <w:r>
+        <w:t># models/client.py</w:t>
+      </w:r>
+    </w:p>
+    <w:p>
+      <w:pPr>
+        <w:pStyle w:val="NormalWeb"/>
+        <w:keepNext/>
+      </w:pPr>
+      <w:r>
+        <w:drawing>
+          <wp:inline distT="0" distB="0" distL="0" distR="0" wp14:anchorId="3D2EDDEE" wp14:editId="36BC9D30">
+            <wp:extent cx="5760720" cy="3766578"/>
+            <wp:effectExtent l="0" t="0" r="0" b="5715"/>
+            <wp:docPr id="18" name="Image 18"/>
+            <wp:cNvGraphicFramePr>
+              <a:graphicFrameLocks xmlns:a="http://schemas.openxmlformats.org/drawingml/2006/main" noChangeAspect="1"/>
+            </wp:cNvGraphicFramePr>
+            <a:graphic xmlns:a="http://schemas.openxmlformats.org/drawingml/2006/main">
+              <a:graphicData uri="http://schemas.openxmlformats.org/drawingml/2006/picture">
+                <pic:pic xmlns:pic="http://schemas.openxmlformats.org/drawingml/2006/picture">
+                  <pic:nvPicPr>
+                    <pic:cNvPr id="0" name=""/>
+                    <pic:cNvPicPr/>
+                  </pic:nvPicPr>
+                  <pic:blipFill>
+                    <a:blip r:embed="rId26"/>
+                    <a:stretch>
+                      <a:fillRect/>
+                    </a:stretch>
+                  </pic:blipFill>
+                  <pic:spPr>
+                    <a:xfrm>
+                      <a:off x="0" y="0"/>
+                      <a:ext cx="5760720" cy="3766578"/>
+                    </a:xfrm>
+                    <a:prstGeom prst="rect">
+                      <a:avLst/>
+                    </a:prstGeom>
+                  </pic:spPr>
+                </pic:pic>
+              </a:graphicData>
+            </a:graphic>
+          </wp:inline>
+        </w:drawing>
+      </w:r>
+      <w:r>
+        <w:t xml:space="preserve"> </w:t>
+      </w:r>
+    </w:p>
+    <w:p>
+      <w:pPr>
+        <w:pStyle w:val="NormalWeb"/>
+        <w:keepNext/>
+      </w:pPr>
+      <w:r>
+        <w:t># models/employe.py</w:t>
+      </w:r>
+    </w:p>
+    <w:p>
+      <w:pPr>
+        <w:pStyle w:val="NormalWeb"/>
+        <w:keepNext/>
+      </w:pPr>
+      <w:r>
+        <w:lastRenderedPageBreak/>
+        <w:drawing>
+          <wp:inline distT="0" distB="0" distL="0" distR="0" wp14:anchorId="3AA47AB0" wp14:editId="1753ADD6">
+            <wp:extent cx="5760720" cy="3726156"/>
+            <wp:effectExtent l="0" t="0" r="0" b="8255"/>
+            <wp:docPr id="17" name="Image 17"/>
+            <wp:cNvGraphicFramePr>
+              <a:graphicFrameLocks xmlns:a="http://schemas.openxmlformats.org/drawingml/2006/main" noChangeAspect="1"/>
+            </wp:cNvGraphicFramePr>
+            <a:graphic xmlns:a="http://schemas.openxmlformats.org/drawingml/2006/main">
+              <a:graphicData uri="http://schemas.openxmlformats.org/drawingml/2006/picture">
+                <pic:pic xmlns:pic="http://schemas.openxmlformats.org/drawingml/2006/picture">
+                  <pic:nvPicPr>
+                    <pic:cNvPr id="0" name=""/>
+                    <pic:cNvPicPr/>
+                  </pic:nvPicPr>
+                  <pic:blipFill>
+                    <a:blip r:embed="rId27"/>
+                    <a:stretch>
+                      <a:fillRect/>
+                    </a:stretch>
+                  </pic:blipFill>
+                  <pic:spPr>
+                    <a:xfrm>
+                      <a:off x="0" y="0"/>
+                      <a:ext cx="5760720" cy="3726156"/>
+                    </a:xfrm>
+                    <a:prstGeom prst="rect">
+                      <a:avLst/>
+                    </a:prstGeom>
+                  </pic:spPr>
+                </pic:pic>
+              </a:graphicData>
+            </a:graphic>
+          </wp:inline>
+        </w:drawing>
+      </w:r>
     </w:p>
     <w:p>
       <w:pPr>
@@ -2912,137 +3797,74 @@
         <w:rPr>
           <w:sz w:val="24"/>
         </w:rPr>
-        <w:t>Ce p</w:t>
-      </w:r>
-      <w:r>
-        <w:rPr>
-          <w:sz w:val="24"/>
-        </w:rPr>
-        <w:t>rojet m’a permis de démontrer :</w:t>
-      </w:r>
-    </w:p>
-    <w:p>
-      <w:pPr>
-        <w:pStyle w:val="Paragraphedeliste"/>
-        <w:numPr>
-          <w:ilvl w:val="0"/>
-          <w:numId w:val="34"/>
-        </w:numPr>
-        <w:rPr>
-          <w:sz w:val="24"/>
-        </w:rPr>
-      </w:pPr>
-      <w:r>
-        <w:rPr>
-          <w:sz w:val="24"/>
-        </w:rPr>
-        <w:t>Ma compréhension de la programmation orientée objet</w:t>
-      </w:r>
-    </w:p>
-    <w:p>
-      <w:pPr>
-        <w:pStyle w:val="Paragraphedeliste"/>
-        <w:numPr>
-          <w:ilvl w:val="0"/>
-          <w:numId w:val="34"/>
-        </w:numPr>
-        <w:rPr>
-          <w:sz w:val="24"/>
-        </w:rPr>
-      </w:pPr>
-      <w:r>
-        <w:rPr>
-          <w:sz w:val="24"/>
-        </w:rPr>
-        <w:t>Ma capacité à concevoir une architecture logicielle claire</w:t>
-      </w:r>
-    </w:p>
-    <w:p>
-      <w:pPr>
-        <w:pStyle w:val="Paragraphedeliste"/>
-        <w:numPr>
-          <w:ilvl w:val="0"/>
-          <w:numId w:val="34"/>
-        </w:numPr>
-        <w:rPr>
-          <w:sz w:val="24"/>
-        </w:rPr>
-      </w:pPr>
-      <w:r>
-        <w:rPr>
-          <w:sz w:val="24"/>
-        </w:rPr>
-        <w:t>Ma maîtrise d’une interface graphique</w:t>
-      </w:r>
-    </w:p>
-    <w:p>
-      <w:pPr>
-        <w:pStyle w:val="Paragraphedeliste"/>
-        <w:numPr>
-          <w:ilvl w:val="0"/>
-          <w:numId w:val="34"/>
-        </w:numPr>
-        <w:rPr>
-          <w:sz w:val="24"/>
-        </w:rPr>
-      </w:pPr>
-      <w:r>
-        <w:rPr>
-          <w:sz w:val="24"/>
-        </w:rPr>
-        <w:t>Ma gestion des validations et erreurs</w:t>
-      </w:r>
-    </w:p>
-    <w:p>
-      <w:pPr>
-        <w:pStyle w:val="Paragraphedeliste"/>
-        <w:numPr>
-          <w:ilvl w:val="0"/>
-          <w:numId w:val="34"/>
-        </w:numPr>
-        <w:rPr>
-          <w:sz w:val="24"/>
-        </w:rPr>
-      </w:pPr>
-      <w:r>
-        <w:rPr>
-          <w:sz w:val="24"/>
-        </w:rPr>
-        <w:t>L’utilisation d’un gestionnaire de code source</w:t>
-      </w:r>
-    </w:p>
-    <w:p>
-      <w:pPr>
-        <w:pStyle w:val="Paragraphedeliste"/>
-        <w:numPr>
-          <w:ilvl w:val="0"/>
-          <w:numId w:val="34"/>
-        </w:numPr>
-        <w:rPr>
-          <w:sz w:val="24"/>
-        </w:rPr>
-      </w:pPr>
-      <w:r>
-        <w:rPr>
-          <w:sz w:val="24"/>
-        </w:rPr>
-        <w:lastRenderedPageBreak/>
-        <w:t>L’application répond aux exigences de la compétence 00Q6.</w:t>
-      </w:r>
-    </w:p>
-    <w:p>
-      <w:pPr>
-        <w:rPr>
-          <w:sz w:val="24"/>
-        </w:rPr>
-      </w:pPr>
-    </w:p>
-    <w:p>
-      <w:pPr>
-        <w:rPr>
-          <w:sz w:val="24"/>
-        </w:rPr>
-      </w:pPr>
+        <w:t xml:space="preserve">Ce projet m'a permis de mettre en pratique les principes fondamentaux de la programmation orientée objet : l'héritage entre les classes (Client, </w:t>
+      </w:r>
+      <w:proofErr w:type="spellStart"/>
+      <w:r>
+        <w:rPr>
+          <w:sz w:val="24"/>
+        </w:rPr>
+        <w:t>Employe</w:t>
+      </w:r>
+      <w:proofErr w:type="spellEnd"/>
+      <w:r>
+        <w:rPr>
+          <w:sz w:val="24"/>
+        </w:rPr>
+        <w:t>, Acteur héritent de Personne), l'encapsulation des données et la séparation des responsabilités</w:t>
+      </w:r>
+      <w:r>
+        <w:rPr>
+          <w:sz w:val="24"/>
+        </w:rPr>
+        <w:t xml:space="preserve"> entre les modèles et les vues.</w:t>
+      </w:r>
+    </w:p>
+    <w:p>
+      <w:pPr>
+        <w:rPr>
+          <w:sz w:val="24"/>
+        </w:rPr>
+      </w:pPr>
+      <w:r>
+        <w:rPr>
+          <w:sz w:val="24"/>
+        </w:rPr>
+        <w:t xml:space="preserve">La principale difficulté rencontrée a été la gestion du flux entre les fenêtres </w:t>
+      </w:r>
+      <w:proofErr w:type="spellStart"/>
+      <w:r>
+        <w:rPr>
+          <w:sz w:val="24"/>
+        </w:rPr>
+        <w:t>Tkinter</w:t>
+      </w:r>
+      <w:proofErr w:type="spellEnd"/>
+      <w:r>
+        <w:rPr>
+          <w:sz w:val="24"/>
+        </w:rPr>
+        <w:t xml:space="preserve"> (connexion → fenêtre principale → formulaire) ainsi que la transmission du niveau d'accès de l'employé </w:t>
+      </w:r>
+      <w:r>
+        <w:rPr>
+          <w:sz w:val="24"/>
+        </w:rPr>
+        <w:t>connecté à travers l'interface.</w:t>
+      </w:r>
+    </w:p>
+    <w:p>
+      <w:pPr>
+        <w:rPr>
+          <w:sz w:val="24"/>
+        </w:rPr>
+      </w:pPr>
+      <w:r>
+        <w:rPr>
+          <w:sz w:val="24"/>
+        </w:rPr>
+        <w:t>L'utilisation de Git a permis de suivre l'évolution du projet commit par commit, ce qui facilite la compréhension de la progression du développement.</w:t>
+      </w:r>
     </w:p>
     <w:p>
       <w:pPr>

</xml_diff>